<commit_message>
docs(srs): fix BR-67 questionnaire as fixed v1 and align open issue 20 (Q-26)
</commit_message>
<xml_diff>
--- a/docs/srs/CryptoPilot_Report3_SRS_v1.0.docx
+++ b/docs/srs/CryptoPilot_Report3_SRS_v1.0.docx
@@ -27895,7 +27895,7 @@
               <w:rPr>
                 <w:sz w:val="18"/>
               </w:rPr>
-              <w:t xml:space="preserve">Risk questionnaire (version 1): 6 questions, 3 on the capacity to bear financial loss and 3 on the attitude to risk; each answer scores 1 to 3 points. The total of each group maps to a risk profile, and the suggested profile is the lower of the two results, so that a high tolerance in one group cannot override a low capacity or attitude in the other. The question texts and score bands are defined in the Technical Design and are configuration values. The questionnaire does not change the risk profile by itself; the Trader chooses the profile (BR-66).</w:t>
+              <w:t xml:space="preserve">Risk questionnaire (version 1): 6 questions, 3 on the capacity to bear financial loss and 3 on the attitude to risk; each answer scores 1 to 3 points. The total of each group maps to a risk profile, and the suggested profile is the lower of the two results, so that a high tolerance in one group cannot override a low capacity or attitude in the other. The question texts, points and score bands of version 1 are fixed and defined in the Technical Design; changing them requires a new version of the questionnaire. The questionnaire does not change the risk profile by itself; the Trader chooses the profile (BR-66).</w:t>
             </w:r>
           </w:p>
         </w:tc>
@@ -33396,7 +33396,7 @@
               <w:rPr>
                 <w:sz w:val="18"/>
               </w:rPr>
-              <w:t xml:space="preserve">Values of BR-66; the use of the maximum total open risk in warnings is to be defined.</w:t>
+              <w:t xml:space="preserve">Values of BR-66; the maximum total open risk is used by the TOTAL_OPEN_RISK warning (BR-29).</w:t>
             </w:r>
           </w:p>
         </w:tc>
@@ -33413,7 +33413,7 @@
               <w:rPr>
                 <w:sz w:val="18"/>
               </w:rPr>
-              <w:t xml:space="preserve">To confirm</w:t>
+              <w:t xml:space="preserve">Confirmed</w:t>
             </w:r>
           </w:p>
         </w:tc>

</xml_diff>

<commit_message>
docs: decide A-02 realized vs net pnl, unblock T-044
</commit_message>
<xml_diff>
--- a/docs/srs/CryptoPilot_Report3_SRS_v1.0.docx
+++ b/docs/srs/CryptoPilot_Report3_SRS_v1.0.docx
@@ -16585,7 +16585,7 @@
               <w:rPr>
                 <w:sz w:val="18"/>
               </w:rPr>
-              <w:t>Record of a simulated or manual trade: execution facts, fees, funding, realized profit/loss and the Trader's review.</w:t>
+              <w:t>Record of a simulated or manual trade: execution facts, fees, funding, realized profit/loss (BR-35; net profit/loss is derived, BR-38) and the Trader's review.</w:t>
             </w:r>
           </w:p>
         </w:tc>
@@ -20097,7 +20097,7 @@
         <w:spacing w:after="60"/>
       </w:pPr>
       <w:r>
-        <w:t>Exit follows BR-35: take profit and stop loss by last price, liquidation by mark price (Futures), stop loss first when both are reached in the same evaluation. On exit the journal record receives exit price, exit time, close reason, fees and realized profit/loss (BR-36, BR-38) and becomes CLOSED; the Trader receives MSG23 or MSG24.</w:t>
+        <w:t>Exit follows BR-35: take profit and stop loss by last price, liquidation by mark price (Futures), stop loss first when both are reached in the same evaluation. On exit the journal record receives exit price, exit time, close reason, realized profit/loss (BR-35) and fees (BR-36) and becomes CLOSED; the Trader receives MSG23 or MSG24.</w:t>
       </w:r>
     </w:p>
     <w:p>
@@ -20233,7 +20233,7 @@
         <w:spacing w:after="60"/>
       </w:pPr>
       <w:r>
-        <w:t>SCR-20 columns: pair, market, direction, entry and exit price, realized profit/loss, result (BR-42), strategy, source, status, entry time. Filters by period, pair, market, source, strategy and result.</w:t>
+        <w:t>SCR-20 columns: pair, market, direction, entry and exit price, net profit/loss (BR-38), result (BR-42), strategy, source, status, entry time. Filters by period, pair, market, source, strategy and result.</w:t>
       </w:r>
     </w:p>
     <w:p>
@@ -20373,7 +20373,7 @@
         <w:spacing w:after="60"/>
       </w:pPr>
       <w:r>
-        <w:t>Realized profit/loss is computed by BR-38 with the fees entered. The record has source MANUAL (BR-41), can be edited and deleted by its owner and is shown separately in statistics.</w:t>
+        <w:t>Realized profit/loss is computed by BR-35 from the prices, and net profit/loss by BR-38 with the fees and funding fee entered. The record has source MANUAL (BR-41), can be edited and deleted by its owner and is shown separately in statistics.</w:t>
       </w:r>
     </w:p>
     <w:p>
@@ -20474,7 +20474,7 @@
         <w:spacing w:after="60"/>
       </w:pPr>
       <w:r>
-        <w:t>Metrics on all plans: number of trades, wins, losses, breakeven, win rate and total realized profit/loss. On PRO and PREMIUM also: average win, average loss, profit factor (gross profit divided by gross loss), average planned risk/reward, average realized R, largest win, largest loss, maximum consecutive losses (BR-42).</w:t>
+        <w:t>Metrics on all plans: number of trades, wins, losses, breakeven, win rate and total net profit/loss (BR-38). On PRO and PREMIUM also: average win, average loss, profit factor (gross profit divided by gross loss), average planned risk/reward, average realized R, largest win, largest loss, maximum consecutive losses (BR-42).</w:t>
       </w:r>
     </w:p>
     <w:p>
@@ -26935,7 +26935,7 @@
               <w:rPr>
                 <w:sz w:val="18"/>
               </w:rPr>
-              <w:t>An open position is closed when the last price reaches the take profit or the stop loss; a futures position is liquidated when the mark price reaches the liquidation price, and the loss equals the initial margin. If stop loss and take profit are both reached within the same evaluation (including candle-based evaluation after downtime), the stop loss is applied first.</w:t>
+              <w:t>An open position is closed when the last price reaches the take profit or the stop loss; a futures position is liquidated when the mark price reaches the liquidation price. Realized profit/loss is the price result of the trade only, without fees or funding: LONG = (exit price − entry price) × quantity; SHORT = (entry price − exit price) × quantity. On liquidation it is never below −initial margin, where initial margin = entry price × quantity / leverage, so a liquidated position loses at most its initial margin through price. If stop loss and take profit are both reached within the same evaluation (including candle-based evaluation after downtime), the stop loss is applied first.</w:t>
             </w:r>
           </w:p>
         </w:tc>
@@ -26965,7 +26965,7 @@
               <w:rPr>
                 <w:sz w:val="18"/>
               </w:rPr>
-              <w:t>Simulated fees: maker rate for LIMIT entries and take profit exits; taker rate for MARKET entries, stop loss, manual close and liquidation. Fee = fill price × quantity × rate. Default rates: Spot 0.1% maker and taker; Futures 0.02% maker and 0.05% taker (configurable).</w:t>
+              <w:t>Simulated fees: maker rate for LIMIT entries and take profit exits; taker rate for MARKET entries, stop loss, manual close and liquidation. Fee = fill price × quantity × rate, where fill price × quantity is the notional at that fill and is not reduced by leverage. The fee amount of a trade (≥ 0) is its entry fee plus its exit fee; Futures plans use the Futures rates and Spot plans the Spot rates. A liquidation is charged the taker fee and no separate liquidation clearance fee. Default rates: Spot 0.1% maker and taker; Futures 0.02% maker and 0.05% taker (configurable). The funding of a Futures trade is the signed sum of its settlements under BR-37, positive when received and negative when paid; a Spot trade has no funding. Net profit/loss follows BR-38.</w:t>
             </w:r>
           </w:p>
         </w:tc>
@@ -27025,7 +27025,7 @@
               <w:rPr>
                 <w:sz w:val="18"/>
               </w:rPr>
-              <w:t>Realized profit/loss: LONG = (exit price − entry price) × quantity − fees + net funding; SHORT = (entry price − exit price) × quantity − fees + net funding.</w:t>
+              <w:t>Net profit/loss = realized profit/loss (BR-35) − fees (BR-36) + net funding (BR-37; 0 for Spot): LONG = (exit price − entry price) × quantity − fees + net funding; SHORT = (entry price − exit price) × quantity − fees + net funding, with the liquidation floor of BR-35 applied to the price part. It is derived from the stored amounts, not stored. The journal list, performance statistics and AI Assistant trade summaries use net profit/loss; the trade detail shows realized profit/loss, fees, funding and net profit/loss separately.</w:t>
             </w:r>
           </w:p>
         </w:tc>
@@ -27145,7 +27145,7 @@
               <w:rPr>
                 <w:sz w:val="18"/>
               </w:rPr>
-              <w:t>Result: WIN if realized profit/loss &gt; 0, LOSS if &lt; 0, BREAKEVEN if = 0. Win rate = wins / (wins + losses). Realized R = realized profit/loss / planned risk amount (trades without stop loss are excluded from R statistics). Average planned risk/reward = mean of the risk/reward ratio (BR-24) of the plan snapshots of simulated trades and of manual trades that have both stop loss and take profit.</w:t>
+              <w:t>Result: WIN if net profit/loss (BR-38) &gt; 0, LOSS if &lt; 0, BREAKEVEN if = 0. Win rate = wins / (wins + losses). Realized R = net profit/loss / planned risk amount (trades without stop loss are excluded from R statistics). Average planned risk/reward = mean of the risk/reward ratio (BR-24) of the plan snapshots of simulated trades and of manual trades that have both stop loss and take profit.</w:t>
             </w:r>
           </w:p>
         </w:tc>

</xml_diff>

<commit_message>
docs: close Q-53 Q-54 Q-55, amend D-97 liquidation fee
</commit_message>
<xml_diff>
--- a/docs/srs/CryptoPilot_Report3_SRS_v1.0.docx
+++ b/docs/srs/CryptoPilot_Report3_SRS_v1.0.docx
@@ -19944,7 +19944,7 @@
         <w:spacing w:after="60"/>
       </w:pPr>
       <w:r>
-        <w:t>SCR-18 shows the plan inputs, the calculation snapshot, warnings and the status history. For an executed plan it shows the live position: current price (mark price for liquidation distance in Futures), unrealized profit/loss, distance to stop loss, take profit and liquidation price, accumulated fees and funding, and a link to the journal entry (SCR-21).</w:t>
+        <w:t>SCR-18 shows the plan inputs, the calculation snapshot, warnings and the status history. For an executed plan it shows the live position: current price (mark price for liquidation distance in Futures), unrealized profit/loss by mark price without fees (LONG = (mark price − entry price) × quantity, SHORT = (entry price − mark price) × quantity), distance to stop loss, take profit and liquidation price, accumulated fees and funding, and a link to the journal entry (SCR-21). The close-position confirmation shows an estimated net profit/loss with its parts: price result at the current price, entry fee paid, estimated exit fee at the taker rate (a manual close is a market order) and funding paid or received so far; after the close the journal entry shows net profit/loss (BR-38).</w:t>
       </w:r>
     </w:p>
     <w:p>
@@ -23983,7 +23983,7 @@
         <w:spacing w:after="60"/>
       </w:pPr>
       <w:r>
-        <w:t>Settings include: spot and futures maker/taker fee rates, the warning thresholds of BR-29 that are not defined by the risk profile, upload size limits, ORDER_EXPIRY_MINUTES and the resend limits of BR-65. Plan limits are maintained in SCR-39; risk profile parameters and setup score presets are configuration values (BR-13, BR-66).</w:t>
+        <w:t>Settings include: spot and futures maker/taker fee rates, the liquidation clearance fee rate, the warning thresholds of BR-29 that are not defined by the risk profile, upload size limits, ORDER_EXPIRY_MINUTES and the resend limits of BR-65. Plan limits are maintained in SCR-39; risk profile parameters and setup score presets are configuration values (BR-13, BR-66).</w:t>
       </w:r>
     </w:p>
     <w:p>
@@ -26935,7 +26935,7 @@
               <w:rPr>
                 <w:sz w:val="18"/>
               </w:rPr>
-              <w:t>An open position is closed when the last price reaches the take profit or the stop loss; a futures position is liquidated when the mark price reaches the liquidation price. Realized profit/loss is the price result of the trade only, without fees or funding: LONG = (exit price − entry price) × quantity; SHORT = (entry price − exit price) × quantity. On liquidation it is never below −initial margin, where initial margin = entry price × quantity / leverage, so a liquidated position loses at most its initial margin through price. If stop loss and take profit are both reached within the same evaluation (including candle-based evaluation after downtime), the stop loss is applied first.</w:t>
+              <w:t>An open position is closed when the last price reaches the take profit or the stop loss; a futures position is liquidated when the mark price reaches the liquidation price. Realized profit/loss is the price result of the trade only, without fees or funding: LONG = (exit price − entry price) × quantity; SHORT = (entry price − exit price) × quantity. On liquidation the exit price is the liquidation price (BR-27) and realized profit/loss is the price result at that price, with no floor; the liquidation clearance fee is a fee under BR-36. If stop loss and take profit are both reached within the same evaluation (including candle-based evaluation after downtime), the stop loss is applied first.</w:t>
             </w:r>
           </w:p>
         </w:tc>
@@ -26965,7 +26965,7 @@
               <w:rPr>
                 <w:sz w:val="18"/>
               </w:rPr>
-              <w:t>Simulated fees: maker rate for LIMIT entries and take profit exits; taker rate for MARKET entries, stop loss, manual close and liquidation. Fee = fill price × quantity × rate, where fill price × quantity is the notional at that fill and is not reduced by leverage. The fee amount of a trade (≥ 0) is its entry fee plus its exit fee; Futures plans use the Futures rates and Spot plans the Spot rates. A liquidation is charged the taker fee and no separate liquidation clearance fee. Default rates: Spot 0.1% maker and taker; Futures 0.02% maker and 0.05% taker (configurable). The funding of a Futures trade is the signed sum of its settlements under BR-37, positive when received and negative when paid; a Spot trade has no funding. Net profit/loss follows BR-38.</w:t>
+              <w:t>Simulated fees: maker rate for LIMIT entries and take profit exits; taker rate for MARKET entries, stop loss and manual close. Fee = fill price × quantity × rate, where fill price × quantity is the notional at that fill and is not reduced by leverage. The fee amount of a trade (≥ 0) is its entry fee plus its exit fee; Futures plans use the Futures rates and Spot plans the Spot rates. A liquidation exit is charged the liquidation clearance fee instead of the taker fee: clearance fee = min(notional at the liquidation price × liquidation clearance fee rate, maintenance margin of the position at the liquidation price), where the maintenance margin is notional × MMR − cum of the bracket under BR-27; it is added to the fee amount together with the entry fee. Default rates: Spot 0.1% maker and taker; Futures 0.02% maker and 0.05% taker; liquidation clearance fee 1.25% (configurable). The funding of a Futures trade is the signed sum of its settlements under BR-37, positive when received and negative when paid; a Spot trade has no funding. Net profit/loss follows BR-38.</w:t>
             </w:r>
           </w:p>
         </w:tc>
@@ -27025,7 +27025,7 @@
               <w:rPr>
                 <w:sz w:val="18"/>
               </w:rPr>
-              <w:t>Net profit/loss = realized profit/loss (BR-35) − fees (BR-36) + net funding (BR-37; 0 for Spot): LONG = (exit price − entry price) × quantity − fees + net funding; SHORT = (entry price − exit price) × quantity − fees + net funding, with the liquidation floor of BR-35 applied to the price part. It is derived from the stored amounts, not stored. The journal list, performance statistics and AI Assistant trade summaries use net profit/loss; the trade detail shows realized profit/loss, fees, funding and net profit/loss separately.</w:t>
+              <w:t>Net profit/loss = realized profit/loss (BR-35) − fees (BR-36) + net funding (BR-37; 0 for Spot): LONG = (exit price − entry price) × quantity − fees + net funding; SHORT = (entry price − exit price) × quantity − fees + net funding; for a liquidation the fees include the liquidation clearance fee (BR-36). It is derived from the stored amounts, not stored. The journal list, performance statistics and AI Assistant trade summaries use net profit/loss; the trade detail shows realized profit/loss, fees, funding and net profit/loss separately.</w:t>
             </w:r>
           </w:p>
         </w:tc>

</xml_diff>

<commit_message>
docs: close Q-56, notification pnl uses net_pnl
</commit_message>
<xml_diff>
--- a/docs/srs/CryptoPilot_Report3_SRS_v1.0.docx
+++ b/docs/srs/CryptoPilot_Report3_SRS_v1.0.docx
@@ -30053,7 +30053,7 @@
               <w:rPr>
                 <w:sz w:val="17"/>
               </w:rPr>
-              <w:t>Position closed</w:t>
+              <w:t>Position closed; {pnl} is the net profit/loss of BR-38 (after the entry fee, the exit fee and funding), the same value as the journal entry</w:t>
             </w:r>
           </w:p>
         </w:tc>
@@ -30128,7 +30128,7 @@
               <w:rPr>
                 <w:sz w:val="17"/>
               </w:rPr>
-              <w:t>Position liquidated</w:t>
+              <w:t>Position liquidated; {pnl} is the net profit/loss of BR-38 (after the entry fee, the liquidation clearance fee and funding), the same value as the journal entry</w:t>
             </w:r>
           </w:p>
         </w:tc>

</xml_diff>

<commit_message>
docs(srs): keep moderation evidence of hidden or reported posts (A-47)
SRS 3.7.2, 3.11.3 and BR-47: a hidden post cannot be edited, the media of a
hidden or reported post is kept on delete, REMOVE_POST added. Session log of
PR #63 review rounds 1 and 2.
</commit_message>
<xml_diff>
--- a/docs/srs/CryptoPilot_Report3_SRS_v1.0.docx
+++ b/docs/srs/CryptoPilot_Report3_SRS_v1.0.docx
@@ -414,6 +414,7 @@
               <w:rPr>
                 <w:sz w:val="19"/>
               </w:rPr>
+              <w:t>22/10/2026</w:t>
             </w:r>
           </w:p>
         </w:tc>
@@ -430,6 +431,7 @@
               <w:rPr>
                 <w:sz w:val="19"/>
               </w:rPr>
+              <w:t>M</w:t>
             </w:r>
           </w:p>
         </w:tc>
@@ -443,6 +445,7 @@
               <w:rPr>
                 <w:sz w:val="19"/>
               </w:rPr>
+              <w:t>CryptoPilot Team</w:t>
             </w:r>
           </w:p>
         </w:tc>
@@ -456,6 +459,7 @@
               <w:rPr>
                 <w:sz w:val="19"/>
               </w:rPr>
+              <w:t>3.7.2, 3.11.3 and BR-47: a HIDDEN post cannot be edited by its author; the media of a hidden or reported post is kept as moderation evidence; REMOVE_POST decision added (registered topic: hide or remove inappropriate content).</w:t>
             </w:r>
           </w:p>
         </w:tc>
@@ -20750,7 +20754,7 @@
         <w:spacing w:after="60"/>
       </w:pPr>
       <w:r>
-        <w:t>The author can edit or delete an own post at any time; deletion is a soft delete (BR-47) and a Media Deletion Request is sent for its media.</w:t>
+        <w:t>The author can edit an own post while it is neither HIDDEN nor DELETED, and delete it while it is not DELETED. Deletion is a soft delete (BR-47) and a Media Deletion Request is sent for its media, unless the post is HIDDEN or has a report that is OPEN, REVIEWING or resolved with HIDE_POST, REMOVE_POST or BAN_USER: those files are kept as the evidence of the moderation (BR-47).</w:t>
       </w:r>
     </w:p>
     <w:p>
@@ -23452,7 +23456,7 @@
         <w:spacing w:after="60"/>
       </w:pPr>
       <w:r>
-        <w:t>Decisions: HIDE_POST (post status HIDDEN), DISMISS, WARN_USER (notification to the author) and BAN_USER (account BANNED and post HIDDEN). All reports of the post are resolved together with resolved_by, resolution action and time; the author and the reporters are notified.</w:t>
+        <w:t>Decisions: HIDE_POST (post status HIDDEN), REMOVE_POST (post status DELETED, its media kept as evidence), DISMISS, WARN_USER (notification to the author) and BAN_USER (account BANNED and post HIDDEN). All reports of the post are resolved together with resolved_by, resolution action and time; the author and the reporters are notified.</w:t>
       </w:r>
     </w:p>
     <w:p>
@@ -27295,7 +27299,7 @@
               <w:rPr>
                 <w:sz w:val="18"/>
               </w:rPr>
-              <w:t>Deleting a post or comment changes its status to DELETED (soft delete). HIDDEN and DELETED posts are visible only to Admin and, for HIDDEN, to the author.</w:t>
+              <w:t>Deleting a post or comment changes its status to DELETED (soft delete). HIDDEN and DELETED posts are visible only to Admin and, for HIDDEN, to the author. A HIDDEN post cannot be edited by its author. The media of a post that is HIDDEN, or has a report OPEN, REVIEWING or resolved with HIDE_POST, REMOVE_POST or BAN_USER, is not deleted from Media Storage.</w:t>
             </w:r>
           </w:p>
         </w:tc>

</xml_diff>

<commit_message>
docs: plan validity, entry deviation and realistic fills (GY-03)
</commit_message>
<xml_diff>
--- a/docs/srs/CryptoPilot_Report3_SRS_v1.0.docx
+++ b/docs/srs/CryptoPilot_Report3_SRS_v1.0.docx
@@ -15088,7 +15088,7 @@
               <w:rPr>
                 <w:sz w:val="18"/>
               </w:rPr>
-              <w:t>Trading Plan Expiry</w:t>
+              <w:t>Trading Plan Expiry and Invalidation</w:t>
             </w:r>
           </w:p>
         </w:tc>
@@ -15102,7 +15102,7 @@
               <w:rPr>
                 <w:sz w:val="18"/>
               </w:rPr>
-              <w:t>Every minute expires ACTIVE plans whose expiry time has passed and notifies the Trader.</w:t>
+              <w:t>Every minute expires ACTIVE plans whose expiry time has passed (MSG53); with each price evaluation of NSF-07, sets ACTIVE plans whose invalidation condition is met to INVALIDATED (BR-68, MSG54); notifies the Trader with the reason.</w:t>
             </w:r>
           </w:p>
         </w:tc>
@@ -19694,7 +19694,7 @@
         <w:spacing w:after="60"/>
       </w:pPr>
       <w:r>
-        <w:t>Fields: pair (enabled), market (Spot or Futures according to the pair; Futures only on PRO and PREMIUM, otherwise MSG29), direction (fixed LONG for Spot, BR-21), entry type LIMIT or MARKET, entry price (required for LIMIT; for MARKET the current last price is shown read-only), stop loss, take profit, capital (default from profile), risk % (default from profile), leverage (Futures only, integer 1 to the maximum allowed, default 1), margin mode ISOLATED (fixed, BR-26), expiry (optional, default 7 days for LIMIT), note.</w:t>
+        <w:t xml:space="preserve">Fields: pair (enabled), market (Spot or Futures according to the pair; Futures only on PRO and PREMIUM, otherwise MSG29), direction (fixed LONG for Spot, BR-21), entry type LIMIT, MARKET or STOP (BR-33), entry price (required for LIMIT; the stop price for STOP; for MARKET the current last price is shown read-only), invalidation price (optional, LIMIT and STOP, BR-68), maximum entry deviation in R (optional, BR-69), stop loss, take profit, capital (default from profile), risk % (default from profile), leverage (Futures only, integer 1 to the maximum allowed, default 1), margin mode ISOLATED (fixed, BR-26), expiry (optional, default 7 days for LIMIT), note.</w:t>
       </w:r>
     </w:p>
     <w:p>
@@ -19834,7 +19834,7 @@
         <w:spacing w:after="60"/>
       </w:pPr>
       <w:r>
-        <w:t>Tabs: Draft, Active, Executed (open and closed positions), Cancelled/Expired.</w:t>
+        <w:t xml:space="preserve">Tabs: Draft, Active, Executed (open and closed positions), Cancelled/Expired (including INVALIDATED plans with their reason, BR-68).</w:t>
       </w:r>
     </w:p>
     <w:p>
@@ -19961,7 +19961,7 @@
         <w:spacing w:after="60"/>
       </w:pPr>
       <w:r>
-        <w:t>Activate (DRAFT): the system re-validates the plan with the current price and checks the limit of ACTIVE plans and open positions of the plan (BR-62, MSG27); if a BLOCKING warning exists MSG18 is shown, otherwise the plan becomes ACTIVE, activated_at is set, the snapshot is stored (BR-31) and MSG19 is shown. A MARKET plan is filled immediately at the current last price (BR-33).</w:t>
+        <w:t xml:space="preserve">Activate (DRAFT): the system re-validates the plan with the current price and checks the limit of ACTIVE plans and open positions of the plan (BR-62, MSG27); if a BLOCKING warning exists MSG18 is shown, otherwise the plan becomes ACTIVE, activated_at is set, the snapshot is stored (BR-31) and MSG19 is shown. A MARKET plan is filled immediately at the current last price (BR-33) after the entry deviation check of BR-69 (MSG51, MSG52).</w:t>
       </w:r>
     </w:p>
     <w:p>
@@ -20140,7 +20140,7 @@
         <w:spacing w:after="60"/>
       </w:pPr>
       <w:r>
-        <w:t>NSF-09 runs every minute and sets ACTIVE plans whose expiry has passed to EXPIRED, with a notification.</w:t>
+        <w:t xml:space="preserve">NSF-09 runs every minute and sets ACTIVE plans whose expiry has passed to EXPIRED, with a notification (MSG53); an ACTIVE plan whose invalidation condition is met on a price evaluation becomes INVALIDATED, with a notification of the reason (BR-68, MSG54). Entry fills record the deviation of BR-69 and the learning data of BR-70.</w:t>
       </w:r>
     </w:p>
     <w:p>
@@ -23987,7 +23987,7 @@
         <w:spacing w:after="60"/>
       </w:pPr>
       <w:r>
-        <w:t>Settings include: spot and futures maker/taker fee rates, the liquidation clearance fee rate, the warning thresholds of BR-29 that are not defined by the risk profile, upload size limits, ORDER_EXPIRY_MINUTES and the resend limits of BR-65. Plan limits are maintained in SCR-39; risk profile parameters and setup score presets are configuration values (BR-13, BR-66).</w:t>
+        <w:t xml:space="preserve">Settings include: spot and futures maker/taker fee rates, the liquidation clearance fee rate, the slippage SLIPPAGE_BPS (BR-36), the entry deviation thresholds ENTRY_DEVIATION_CONFIRM_R and ENTRY_DEVIATION_BLOCK_R (BR-69), the setup score drop warning SETUP_SCORE_DROP_WARN (BR-70), the warning thresholds of BR-29 that are not defined by the risk profile, upload size limits, ORDER_EXPIRY_MINUTES and the resend limits of BR-65. Plan limits are maintained in SCR-39; risk profile parameters and setup score presets are configuration values (BR-13, BR-66).</w:t>
       </w:r>
     </w:p>
     <w:p>
@@ -26849,7 +26849,7 @@
               <w:rPr>
                 <w:sz w:val="18"/>
               </w:rPr>
-              <w:t>Plan lifecycle: DRAFT → ACTIVE → EXECUTED; DRAFT or ACTIVE → CANCELLED by the Trader; ACTIVE → EXPIRED when the expiry time passes before the entry is filled. Only DRAFT plans can be edited.</w:t>
+              <w:t xml:space="preserve">Plan lifecycle: DRAFT → ACTIVE → EXECUTED; DRAFT or ACTIVE → CANCELLED by the Trader; ACTIVE → EXPIRED when the expiry time passes before the entry is filled; ACTIVE → INVALIDATED when a condition of BR-68 is met before the entry is filled. EXECUTED, CANCELLED, EXPIRED and INVALIDATED are final. Only DRAFT plans can be edited.</w:t>
             </w:r>
           </w:p>
         </w:tc>
@@ -26879,7 +26879,7 @@
               <w:rPr>
                 <w:sz w:val="18"/>
               </w:rPr>
-              <w:t>A LIMIT entry of a LONG plan is filled when the last price is equal to or below the entry price, and of a SHORT plan when it is equal to or above the entry price; the fill price is the entry price. If the condition is already met at activation, or the entry type is MARKET, the plan is filled immediately at the current last price. The quantity of the plan snapshot is used.</w:t>
+              <w:t xml:space="preserve">Entry types are LIMIT, MARKET and STOP (stop-market). A LIMIT entry of a LONG plan is filled when the last price is equal to or below the entry price, and of a SHORT plan when it is equal to or above the entry price; reached after activation, it fills at the entry price, also when the price moved past it. A STOP entry of a LONG plan is triggered when the last price is equal to or above the stop price, and of a SHORT plan when it is equal to or below it; it fills at the stop price, or at the opening price of the 1-minute candle when that price is already beyond the stop price. If a LIMIT condition is already met at activation, or the entry type is MARKET, the plan is filled immediately at the current last price (a MARKET plan after the check of BR-69). The last price is the last trade price on both markets; on Futures it is taken from the 1-minute candle stream, and the mark price is used only for liquidation and unrealized profit/loss. A fill executed against the market includes the slippage of BR-36. The quantity of the plan snapshot is used.</w:t>
             </w:r>
           </w:p>
         </w:tc>
@@ -26969,7 +26969,7 @@
               <w:rPr>
                 <w:sz w:val="18"/>
               </w:rPr>
-              <w:t>Simulated fees: maker rate for LIMIT entries and take profit exits; taker rate for MARKET entries, stop loss and manual close. Fee = fill price × quantity × rate, where fill price × quantity is the notional at that fill and is not reduced by leverage. The fee amount of a trade (≥ 0) is its entry fee plus its exit fee; Futures plans use the Futures rates and Spot plans the Spot rates. A liquidation exit is charged the liquidation clearance fee instead of the taker fee: clearance fee = min(notional at the liquidation price × liquidation clearance fee rate, maintenance margin of the position at the liquidation price), where the maintenance margin is notional × MMR − cum of the bracket under BR-27; it is added to the fee amount together with the entry fee. Default rates: Spot 0.1% maker and taker; Futures 0.02% maker and 0.05% taker; liquidation clearance fee 1.25% (configurable). The funding of a Futures trade is the signed sum of its settlements under BR-37, positive when received and negative when paid; a Spot trade has no funding. Net profit/loss follows BR-38.</w:t>
+              <w:t xml:space="preserve">Simulated fees follow the liquidity role of each fill: the maker rate when the order rested and was then reached (a LIMIT entry filled after activation, a take profit exit); the taker rate when it executed against the market (MARKET and STOP entries, a LIMIT entry already reached at activation, stop loss and manual close). A taker fill price is moved against the Trader by the configurable slippage SLIPPAGE_BPS (default 0 basis points): a buy at price × (1 + slippage), a sell at price × (1 − slippage), rounded to the tick against the Trader; maker fills and liquidations have no slippage. Fee = fill price × quantity × rate, where fill price × quantity is the notional at that fill and is not reduced by leverage. The fee amount of a trade (≥ 0) is its entry fee plus its exit fee; Futures plans use the Futures rates and Spot plans the Spot rates. A liquidation exit is charged the liquidation clearance fee instead of the taker fee: clearance fee = min(notional at the liquidation price × liquidation clearance fee rate, maintenance margin of the position at the liquidation price), where the maintenance margin is notional × MMR − cum of the bracket under BR-27; it is added to the fee amount together with the entry fee. Default rates: Spot 0.1% maker and taker; Futures 0.02% maker and 0.05% taker; liquidation clearance fee 1.25% (configurable). The funding of a Futures trade is the signed sum of its settlements under BR-37, positive when received and negative when paid; a Spot trade has no funding. Net profit/loss follows BR-38.</w:t>
             </w:r>
           </w:p>
         </w:tc>
@@ -27900,6 +27900,96 @@
                 <w:sz w:val="18"/>
               </w:rPr>
               <w:t xml:space="preserve">Risk questionnaire (version 1): 6 questions, 3 on the capacity to bear financial loss and 3 on the attitude to risk; each answer scores 1 to 3 points. The total of each group maps to a risk profile, and the suggested profile is the lower of the two results, so that a high tolerance in one group cannot override a low capacity or attitude in the other. The question texts, points and score bands of version 1 are fixed and defined in the Technical Design; changing them requires a new version of the questionnaire. The questionnaire does not change the risk profile by itself; the Trader chooses the profile (BR-66).</w:t>
+            </w:r>
+          </w:p>
+        </w:tc>
+      </w:tr>
+      <w:tr>
+        <w:tc>
+          <w:tcPr>
+            <w:tcW w:type="dxa" w:w="1008"/>
+          </w:tcPr>
+          <w:p>
+            <w:r/>
+            <w:r>
+              <w:rPr>
+                <w:sz w:val="18"/>
+              </w:rPr>
+              <w:t xml:space="preserve">BR-68</w:t>
+            </w:r>
+          </w:p>
+        </w:tc>
+        <w:tc>
+          <w:tcPr>
+            <w:tcW w:type="dxa" w:w="7920"/>
+          </w:tcPr>
+          <w:p>
+            <w:r/>
+            <w:r>
+              <w:rPr>
+                <w:sz w:val="18"/>
+              </w:rPr>
+              <w:t xml:space="preserve">Invalidation of a waiting plan: an ACTIVE LIMIT or STOP plan becomes INVALIDATED, before its entry is filled, when (a) for LIMIT the last price reaches the take profit, (b) for STOP the last price reaches the stop loss, or (c) the last price reaches the optional invalidation price. The invalidation price must lie on the other side of the current price from the entry, so that the price can reach it before the entry; it is checked when the plan is saved and when it is activated (MSG15). A MARKET plan has no invalidation price. When one 1-minute candle reaches both the entry and an invalidation level, the level that its opening price is already beyond decides; otherwise the plan is invalidated. Prices from before the activation are not used, and candles evaluated after downtime follow the same rules. An INVALIDATED or EXPIRED plan no longer counts toward the limit of ACTIVE plans (BR-62); the Trader is notified with the reason (MSG53, MSG54).</w:t>
+            </w:r>
+          </w:p>
+        </w:tc>
+      </w:tr>
+      <w:tr>
+        <w:tc>
+          <w:tcPr>
+            <w:tcW w:type="dxa" w:w="1008"/>
+          </w:tcPr>
+          <w:p>
+            <w:r/>
+            <w:r>
+              <w:rPr>
+                <w:sz w:val="18"/>
+              </w:rPr>
+              <w:t xml:space="preserve">BR-69</w:t>
+            </w:r>
+          </w:p>
+        </w:tc>
+        <w:tc>
+          <w:tcPr>
+            <w:tcW w:type="dxa" w:w="7920"/>
+          </w:tcPr>
+          <w:p>
+            <w:r/>
+            <w:r>
+              <w:rPr>
+                <w:sz w:val="18"/>
+              </w:rPr>
+              <w:t xml:space="preserve">Entry deviation: the planned entry price is the entered price for LIMIT and STOP plans and the reference price at the last draft save for MARKET plans. Deviation in R = d × (fill price − planned entry price) / |planned entry price − stop loss|, with d = +1 for LONG and −1 for SHORT; a positive value is a worse entry. When a MARKET plan is activated, a deviation below ENTRY_DEVIATION_CONFIRM_R (default 0.25) is accepted; a deviation from that value up to and including ENTRY_DEVIATION_BLOCK_R (default 0.75) requires the Trader to confirm the recalculated quantity, risk/reward and deviation (MSG51); a larger deviation, or a price at or beyond the take profit, is refused (MSG52). A plan may set its own maximum deviation, which can only be lower than ENTRY_DEVIATION_BLOCK_R. The risk amount stays as planned and the quantity is recalculated. Every fill records its deviation.</w:t>
+            </w:r>
+          </w:p>
+        </w:tc>
+      </w:tr>
+      <w:tr>
+        <w:tc>
+          <w:tcPr>
+            <w:tcW w:type="dxa" w:w="1008"/>
+          </w:tcPr>
+          <w:p>
+            <w:r/>
+            <w:r>
+              <w:rPr>
+                <w:sz w:val="18"/>
+              </w:rPr>
+              <w:t xml:space="preserve">BR-70</w:t>
+            </w:r>
+          </w:p>
+        </w:tc>
+        <w:tc>
+          <w:tcPr>
+            <w:tcW w:type="dxa" w:w="7920"/>
+          </w:tcPr>
+          <w:p>
+            <w:r/>
+            <w:r>
+              <w:rPr>
+                <w:sz w:val="18"/>
+              </w:rPr>
+              <w:t xml:space="preserve">Learning data of a simulated trade: at the fill the system stores the planned entry price, the deviation (BR-69), the liquidity role (BR-36), the planned risk amount, the setup score of the plan and at the fill, and the indicator values at the fill (RSI14, EMA20, EMA50, EMA200, MACD). A drop of the setup score of at least SETUP_SCORE_DROP_WARN points (default 15) adds a warning to the journal entry and notifies the Trader (MSG55); it never blocks the fill. While the position is open the system keeps its most adverse and most favourable price. Derived and not stored: R-multiple = net profit/loss / planned risk amount (the realized R of BR-42); expectancy = average R-multiple; average deviation and cost of late entry = sum of the deviations in R; maximum adverse and favourable excursion in R = excursion × quantity / planned risk amount.</w:t>
             </w:r>
           </w:p>
         </w:tc>
@@ -32026,6 +32116,381 @@
           </w:p>
         </w:tc>
       </w:tr>
+      <w:tr>
+        <w:tc>
+          <w:tcPr>
+            <w:tcW w:type="dxa" w:w="504"/>
+          </w:tcPr>
+          <w:p>
+            <w:pPr>
+              <w:jc w:val="center"/>
+            </w:pPr>
+            <w:r/>
+            <w:r>
+              <w:rPr>
+                <w:sz w:val="17"/>
+              </w:rPr>
+              <w:t xml:space="preserve">51</w:t>
+            </w:r>
+          </w:p>
+        </w:tc>
+        <w:tc>
+          <w:tcPr>
+            <w:tcW w:type="dxa" w:w="1080"/>
+          </w:tcPr>
+          <w:p>
+            <w:r/>
+            <w:r>
+              <w:rPr>
+                <w:sz w:val="17"/>
+              </w:rPr>
+              <w:t xml:space="preserve">MSG51</w:t>
+            </w:r>
+          </w:p>
+        </w:tc>
+        <w:tc>
+          <w:tcPr>
+            <w:tcW w:type="dxa" w:w="1728"/>
+          </w:tcPr>
+          <w:p>
+            <w:r/>
+            <w:r>
+              <w:rPr>
+                <w:sz w:val="17"/>
+              </w:rPr>
+              <w:t xml:space="preserve">Confirmation dialog</w:t>
+            </w:r>
+          </w:p>
+        </w:tc>
+        <w:tc>
+          <w:tcPr>
+            <w:tcW w:type="dxa" w:w="2304"/>
+          </w:tcPr>
+          <w:p>
+            <w:r/>
+            <w:r>
+              <w:rPr>
+                <w:sz w:val="17"/>
+              </w:rPr>
+              <w:t xml:space="preserve">Market entry moved from the plan (BR-69)</w:t>
+            </w:r>
+          </w:p>
+        </w:tc>
+        <w:tc>
+          <w:tcPr>
+            <w:tcW w:type="dxa" w:w="3312"/>
+          </w:tcPr>
+          <w:p>
+            <w:r/>
+            <w:r>
+              <w:rPr>
+                <w:sz w:val="17"/>
+              </w:rPr>
+              <w:t xml:space="preserve">The price has moved {deviation}R from your plan. New quantity {quantity}, risk/reward {rr}. Activate anyway?</w:t>
+            </w:r>
+          </w:p>
+        </w:tc>
+      </w:tr>
+      <w:tr>
+        <w:tc>
+          <w:tcPr>
+            <w:tcW w:type="dxa" w:w="504"/>
+          </w:tcPr>
+          <w:p>
+            <w:pPr>
+              <w:jc w:val="center"/>
+            </w:pPr>
+            <w:r/>
+            <w:r>
+              <w:rPr>
+                <w:sz w:val="17"/>
+              </w:rPr>
+              <w:t xml:space="preserve">52</w:t>
+            </w:r>
+          </w:p>
+        </w:tc>
+        <w:tc>
+          <w:tcPr>
+            <w:tcW w:type="dxa" w:w="1080"/>
+          </w:tcPr>
+          <w:p>
+            <w:r/>
+            <w:r>
+              <w:rPr>
+                <w:sz w:val="17"/>
+              </w:rPr>
+              <w:t xml:space="preserve">MSG52</w:t>
+            </w:r>
+          </w:p>
+        </w:tc>
+        <w:tc>
+          <w:tcPr>
+            <w:tcW w:type="dxa" w:w="1728"/>
+          </w:tcPr>
+          <w:p>
+            <w:r/>
+            <w:r>
+              <w:rPr>
+                <w:sz w:val="17"/>
+              </w:rPr>
+              <w:t xml:space="preserve">Error banner</w:t>
+            </w:r>
+          </w:p>
+        </w:tc>
+        <w:tc>
+          <w:tcPr>
+            <w:tcW w:type="dxa" w:w="2304"/>
+          </w:tcPr>
+          <w:p>
+            <w:r/>
+            <w:r>
+              <w:rPr>
+                <w:sz w:val="17"/>
+              </w:rPr>
+              <w:t xml:space="preserve">Market entry refused (BR-69)</w:t>
+            </w:r>
+          </w:p>
+        </w:tc>
+        <w:tc>
+          <w:tcPr>
+            <w:tcW w:type="dxa" w:w="3312"/>
+          </w:tcPr>
+          <w:p>
+            <w:r/>
+            <w:r>
+              <w:rPr>
+                <w:sz w:val="17"/>
+              </w:rPr>
+              <w:t xml:space="preserve">The price has moved {deviation}R from your plan, beyond the allowed {max}R or past the take profit. The plan was not activated.</w:t>
+            </w:r>
+          </w:p>
+        </w:tc>
+      </w:tr>
+      <w:tr>
+        <w:tc>
+          <w:tcPr>
+            <w:tcW w:type="dxa" w:w="504"/>
+          </w:tcPr>
+          <w:p>
+            <w:pPr>
+              <w:jc w:val="center"/>
+            </w:pPr>
+            <w:r/>
+            <w:r>
+              <w:rPr>
+                <w:sz w:val="17"/>
+              </w:rPr>
+              <w:t xml:space="preserve">53</w:t>
+            </w:r>
+          </w:p>
+        </w:tc>
+        <w:tc>
+          <w:tcPr>
+            <w:tcW w:type="dxa" w:w="1080"/>
+          </w:tcPr>
+          <w:p>
+            <w:r/>
+            <w:r>
+              <w:rPr>
+                <w:sz w:val="17"/>
+              </w:rPr>
+              <w:t xml:space="preserve">MSG53</w:t>
+            </w:r>
+          </w:p>
+        </w:tc>
+        <w:tc>
+          <w:tcPr>
+            <w:tcW w:type="dxa" w:w="1728"/>
+          </w:tcPr>
+          <w:p>
+            <w:r/>
+            <w:r>
+              <w:rPr>
+                <w:sz w:val="17"/>
+              </w:rPr>
+              <w:t xml:space="preserve">Notification</w:t>
+            </w:r>
+          </w:p>
+        </w:tc>
+        <w:tc>
+          <w:tcPr>
+            <w:tcW w:type="dxa" w:w="2304"/>
+          </w:tcPr>
+          <w:p>
+            <w:r/>
+            <w:r>
+              <w:rPr>
+                <w:sz w:val="17"/>
+              </w:rPr>
+              <w:t xml:space="preserve">Plan expired (NSF-09)</w:t>
+            </w:r>
+          </w:p>
+        </w:tc>
+        <w:tc>
+          <w:tcPr>
+            <w:tcW w:type="dxa" w:w="3312"/>
+          </w:tcPr>
+          <w:p>
+            <w:r/>
+            <w:r>
+              <w:rPr>
+                <w:sz w:val="17"/>
+              </w:rPr>
+              <w:t xml:space="preserve">{pair} {direction} plan expired before its entry was filled.</w:t>
+            </w:r>
+          </w:p>
+        </w:tc>
+      </w:tr>
+      <w:tr>
+        <w:tc>
+          <w:tcPr>
+            <w:tcW w:type="dxa" w:w="504"/>
+          </w:tcPr>
+          <w:p>
+            <w:pPr>
+              <w:jc w:val="center"/>
+            </w:pPr>
+            <w:r/>
+            <w:r>
+              <w:rPr>
+                <w:sz w:val="17"/>
+              </w:rPr>
+              <w:t xml:space="preserve">54</w:t>
+            </w:r>
+          </w:p>
+        </w:tc>
+        <w:tc>
+          <w:tcPr>
+            <w:tcW w:type="dxa" w:w="1080"/>
+          </w:tcPr>
+          <w:p>
+            <w:r/>
+            <w:r>
+              <w:rPr>
+                <w:sz w:val="17"/>
+              </w:rPr>
+              <w:t xml:space="preserve">MSG54</w:t>
+            </w:r>
+          </w:p>
+        </w:tc>
+        <w:tc>
+          <w:tcPr>
+            <w:tcW w:type="dxa" w:w="1728"/>
+          </w:tcPr>
+          <w:p>
+            <w:r/>
+            <w:r>
+              <w:rPr>
+                <w:sz w:val="17"/>
+              </w:rPr>
+              <w:t xml:space="preserve">Notification</w:t>
+            </w:r>
+          </w:p>
+        </w:tc>
+        <w:tc>
+          <w:tcPr>
+            <w:tcW w:type="dxa" w:w="2304"/>
+          </w:tcPr>
+          <w:p>
+            <w:r/>
+            <w:r>
+              <w:rPr>
+                <w:sz w:val="17"/>
+              </w:rPr>
+              <w:t xml:space="preserve">Plan invalidated (BR-68)</w:t>
+            </w:r>
+          </w:p>
+        </w:tc>
+        <w:tc>
+          <w:tcPr>
+            <w:tcW w:type="dxa" w:w="3312"/>
+          </w:tcPr>
+          <w:p>
+            <w:r/>
+            <w:r>
+              <w:rPr>
+                <w:sz w:val="17"/>
+              </w:rPr>
+              <w:t xml:space="preserve">{pair} {direction} plan was invalidated before its entry was filled: {reason}.</w:t>
+            </w:r>
+          </w:p>
+        </w:tc>
+      </w:tr>
+      <w:tr>
+        <w:tc>
+          <w:tcPr>
+            <w:tcW w:type="dxa" w:w="504"/>
+          </w:tcPr>
+          <w:p>
+            <w:pPr>
+              <w:jc w:val="center"/>
+            </w:pPr>
+            <w:r/>
+            <w:r>
+              <w:rPr>
+                <w:sz w:val="17"/>
+              </w:rPr>
+              <w:t xml:space="preserve">55</w:t>
+            </w:r>
+          </w:p>
+        </w:tc>
+        <w:tc>
+          <w:tcPr>
+            <w:tcW w:type="dxa" w:w="1080"/>
+          </w:tcPr>
+          <w:p>
+            <w:r/>
+            <w:r>
+              <w:rPr>
+                <w:sz w:val="17"/>
+              </w:rPr>
+              <w:t xml:space="preserve">MSG55</w:t>
+            </w:r>
+          </w:p>
+        </w:tc>
+        <w:tc>
+          <w:tcPr>
+            <w:tcW w:type="dxa" w:w="1728"/>
+          </w:tcPr>
+          <w:p>
+            <w:r/>
+            <w:r>
+              <w:rPr>
+                <w:sz w:val="17"/>
+              </w:rPr>
+              <w:t xml:space="preserve">Notification</w:t>
+            </w:r>
+          </w:p>
+        </w:tc>
+        <w:tc>
+          <w:tcPr>
+            <w:tcW w:type="dxa" w:w="2304"/>
+          </w:tcPr>
+          <w:p>
+            <w:r/>
+            <w:r>
+              <w:rPr>
+                <w:sz w:val="17"/>
+              </w:rPr>
+              <w:t xml:space="preserve">Setup score dropped at the fill (BR-70)</w:t>
+            </w:r>
+          </w:p>
+        </w:tc>
+        <w:tc>
+          <w:tcPr>
+            <w:tcW w:type="dxa" w:w="3312"/>
+          </w:tcPr>
+          <w:p>
+            <w:r/>
+            <w:r>
+              <w:rPr>
+                <w:sz w:val="17"/>
+              </w:rPr>
+              <w:t xml:space="preserve">{pair} entry filled with a setup score of {scoreAtFill}, down from {scoreAtPlan} when planned.</w:t>
+            </w:r>
+          </w:p>
+        </w:tc>
+      </w:tr>
     </w:tbl>
     <w:p>
       <w:pPr>
@@ -32376,7 +32841,7 @@
               <w:rPr>
                 <w:sz w:val="18"/>
               </w:rPr>
-              <w:t>LIMIT and MARKET (BR-33).</w:t>
+              <w:t xml:space="preserve">LIMIT, MARKET and STOP (stop-market); no stop-limit (BR-33).</w:t>
             </w:r>
           </w:p>
         </w:tc>

</xml_diff>

<commit_message>
docs(srs): align the community with the registered topic (A-44)
Guests read the community, PRO posts videos, official posts have a category,
and 3.7.1 describes search, the author filter, member pages and the coin
discussion (E-4, E-5 of D-99 phase 2).
</commit_message>
<xml_diff>
--- a/docs/srs/CryptoPilot_Report3_SRS_v1.0.docx
+++ b/docs/srs/CryptoPilot_Report3_SRS_v1.0.docx
@@ -478,6 +478,7 @@
               <w:rPr>
                 <w:sz w:val="19"/>
               </w:rPr>
+              <w:t>22/10/2026</w:t>
             </w:r>
           </w:p>
         </w:tc>
@@ -494,6 +495,7 @@
               <w:rPr>
                 <w:sz w:val="19"/>
               </w:rPr>
+              <w:t>M</w:t>
             </w:r>
           </w:p>
         </w:tc>
@@ -507,6 +509,7 @@
               <w:rPr>
                 <w:sz w:val="19"/>
               </w:rPr>
+              <w:t>CryptoPilot Team</w:t>
             </w:r>
           </w:p>
         </w:tc>
@@ -520,6 +523,7 @@
               <w:rPr>
                 <w:sz w:val="19"/>
               </w:rPr>
+              <w:t>Community aligned with the registered topic (A-44): Guests read the community (actor, UC-26, 3.1.3, SCR-24, 3.7.1); video posting on PRO and PREMIUM (UC-28, 3.7.2, Table 3.1, BR-43, BR-62); official post categories (UC-44, 3.7.2, BR-61, FORUM_POST); search, author filter, member page and coin discussion (3.7.1).</w:t>
             </w:r>
           </w:p>
         </w:tc>
@@ -4994,7 +4998,7 @@
               <w:rPr>
                 <w:sz w:val="19"/>
               </w:rPr>
-              <w:t>A visitor who has not logged in. A Guest can view the public market overview, register an account, verify the email address, log in and reset a forgotten password.</w:t>
+              <w:t xml:space="preserve">A visitor who has not logged in. A Guest can view the public market overview, read the public community posts, their comments, the community discussion of a coin and member pages, register an account, verify the email address, log in and reset a forgotten password.</w:t>
             </w:r>
           </w:p>
         </w:tc>
@@ -7740,6 +7744,238 @@
               <w:rPr>
                 <w:sz w:val="18"/>
               </w:rPr>
+              <w:t xml:space="preserve">Guest, Trader</w:t>
+            </w:r>
+          </w:p>
+        </w:tc>
+        <w:tc>
+          <w:tcPr>
+            <w:tcW w:type="dxa" w:w="3888"/>
+          </w:tcPr>
+          <w:p>
+            <w:r/>
+            <w:r>
+              <w:rPr>
+                <w:sz w:val="18"/>
+              </w:rPr>
+              <w:t xml:space="preserve">Guest or Trader browses, searches, filters and opens community posts, official announcements, the discussion of a coin and member pages; the Saved and My Posts tabs need a Trader.</w:t>
+            </w:r>
+          </w:p>
+        </w:tc>
+      </w:tr>
+      <w:tr>
+        <w:tc>
+          <w:tcPr>
+            <w:tcW w:type="dxa" w:w="864"/>
+          </w:tcPr>
+          <w:p>
+            <w:r/>
+            <w:r>
+              <w:rPr>
+                <w:sz w:val="18"/>
+              </w:rPr>
+              <w:t>UC-27</w:t>
+            </w:r>
+          </w:p>
+        </w:tc>
+        <w:tc>
+          <w:tcPr>
+            <w:tcW w:type="dxa" w:w="2160"/>
+          </w:tcPr>
+          <w:p>
+            <w:r/>
+            <w:r>
+              <w:rPr>
+                <w:sz w:val="18"/>
+              </w:rPr>
+              <w:t>Create Post</w:t>
+            </w:r>
+          </w:p>
+        </w:tc>
+        <w:tc>
+          <w:tcPr>
+            <w:tcW w:type="dxa" w:w="2016"/>
+          </w:tcPr>
+          <w:p>
+            <w:r/>
+            <w:r>
+              <w:rPr>
+                <w:sz w:val="18"/>
+              </w:rPr>
+              <w:t>Trader, Media Storage</w:t>
+            </w:r>
+          </w:p>
+        </w:tc>
+        <w:tc>
+          <w:tcPr>
+            <w:tcW w:type="dxa" w:w="3888"/>
+          </w:tcPr>
+          <w:p>
+            <w:r/>
+            <w:r>
+              <w:rPr>
+                <w:sz w:val="18"/>
+              </w:rPr>
+              <w:t>Trader publishes a text post with optional images, coin tags and market type.</w:t>
+            </w:r>
+          </w:p>
+        </w:tc>
+      </w:tr>
+      <w:tr>
+        <w:tc>
+          <w:tcPr>
+            <w:tcW w:type="dxa" w:w="864"/>
+          </w:tcPr>
+          <w:p>
+            <w:r/>
+            <w:r>
+              <w:rPr>
+                <w:sz w:val="18"/>
+              </w:rPr>
+              <w:t xml:space="preserve">UC-28</w:t>
+            </w:r>
+          </w:p>
+        </w:tc>
+        <w:tc>
+          <w:tcPr>
+            <w:tcW w:type="dxa" w:w="2160"/>
+          </w:tcPr>
+          <w:p>
+            <w:r/>
+            <w:r>
+              <w:rPr>
+                <w:sz w:val="18"/>
+              </w:rPr>
+              <w:t xml:space="preserve">Post Video</w:t>
+            </w:r>
+          </w:p>
+        </w:tc>
+        <w:tc>
+          <w:tcPr>
+            <w:tcW w:type="dxa" w:w="2016"/>
+          </w:tcPr>
+          <w:p>
+            <w:r/>
+            <w:r>
+              <w:rPr>
+                <w:sz w:val="18"/>
+              </w:rPr>
+              <w:t xml:space="preserve">Trader (PRO, PREMIUM), Media Storage</w:t>
+            </w:r>
+          </w:p>
+        </w:tc>
+        <w:tc>
+          <w:tcPr>
+            <w:tcW w:type="dxa" w:w="3888"/>
+          </w:tcPr>
+          <w:p>
+            <w:r/>
+            <w:r>
+              <w:rPr>
+                <w:sz w:val="18"/>
+              </w:rPr>
+              <w:t xml:space="preserve">Trader with an active PRO or PREMIUM plan publishes a video post.</w:t>
+            </w:r>
+          </w:p>
+        </w:tc>
+      </w:tr>
+      <w:tr>
+        <w:tc>
+          <w:tcPr>
+            <w:tcW w:type="dxa" w:w="864"/>
+          </w:tcPr>
+          <w:p>
+            <w:r/>
+            <w:r>
+              <w:rPr>
+                <w:sz w:val="18"/>
+              </w:rPr>
+              <w:t>UC-29</w:t>
+            </w:r>
+          </w:p>
+        </w:tc>
+        <w:tc>
+          <w:tcPr>
+            <w:tcW w:type="dxa" w:w="2160"/>
+          </w:tcPr>
+          <w:p>
+            <w:r/>
+            <w:r>
+              <w:rPr>
+                <w:sz w:val="18"/>
+              </w:rPr>
+              <w:t>Manage Own Posts</w:t>
+            </w:r>
+          </w:p>
+        </w:tc>
+        <w:tc>
+          <w:tcPr>
+            <w:tcW w:type="dxa" w:w="2016"/>
+          </w:tcPr>
+          <w:p>
+            <w:r/>
+            <w:r>
+              <w:rPr>
+                <w:sz w:val="18"/>
+              </w:rPr>
+              <w:t>Trader, Media Storage</w:t>
+            </w:r>
+          </w:p>
+        </w:tc>
+        <w:tc>
+          <w:tcPr>
+            <w:tcW w:type="dxa" w:w="3888"/>
+          </w:tcPr>
+          <w:p>
+            <w:r/>
+            <w:r>
+              <w:rPr>
+                <w:sz w:val="18"/>
+              </w:rPr>
+              <w:t>Trader edits or deletes own posts.</w:t>
+            </w:r>
+          </w:p>
+        </w:tc>
+      </w:tr>
+      <w:tr>
+        <w:tc>
+          <w:tcPr>
+            <w:tcW w:type="dxa" w:w="864"/>
+          </w:tcPr>
+          <w:p>
+            <w:r/>
+            <w:r>
+              <w:rPr>
+                <w:sz w:val="18"/>
+              </w:rPr>
+              <w:t>UC-30</w:t>
+            </w:r>
+          </w:p>
+        </w:tc>
+        <w:tc>
+          <w:tcPr>
+            <w:tcW w:type="dxa" w:w="2160"/>
+          </w:tcPr>
+          <w:p>
+            <w:r/>
+            <w:r>
+              <w:rPr>
+                <w:sz w:val="18"/>
+              </w:rPr>
+              <w:t>Comment on Post</w:t>
+            </w:r>
+          </w:p>
+        </w:tc>
+        <w:tc>
+          <w:tcPr>
+            <w:tcW w:type="dxa" w:w="2016"/>
+          </w:tcPr>
+          <w:p>
+            <w:r/>
+            <w:r>
+              <w:rPr>
+                <w:sz w:val="18"/>
+              </w:rPr>
               <w:t>Trader</w:t>
             </w:r>
           </w:p>
@@ -7754,7 +7990,7 @@
               <w:rPr>
                 <w:sz w:val="18"/>
               </w:rPr>
-              <w:t>Trader browses, filters and opens community posts and official announcements.</w:t>
+              <w:t>Trader comments on a post or replies to a comment, and edits or deletes own comments.</w:t>
             </w:r>
           </w:p>
         </w:tc>
@@ -7770,7 +8006,7 @@
               <w:rPr>
                 <w:sz w:val="18"/>
               </w:rPr>
-              <w:t>UC-27</w:t>
+              <w:t>UC-31</w:t>
             </w:r>
           </w:p>
         </w:tc>
@@ -7784,7 +8020,7 @@
               <w:rPr>
                 <w:sz w:val="18"/>
               </w:rPr>
-              <w:t>Create Post</w:t>
+              <w:t>React to Content</w:t>
             </w:r>
           </w:p>
         </w:tc>
@@ -7798,7 +8034,7 @@
               <w:rPr>
                 <w:sz w:val="18"/>
               </w:rPr>
-              <w:t>Trader, Media Storage</w:t>
+              <w:t>Trader</w:t>
             </w:r>
           </w:p>
         </w:tc>
@@ -7812,7 +8048,7 @@
               <w:rPr>
                 <w:sz w:val="18"/>
               </w:rPr>
-              <w:t>Trader publishes a text post with optional images, coin tags and market type.</w:t>
+              <w:t>Trader likes or unlikes a post or a comment.</w:t>
             </w:r>
           </w:p>
         </w:tc>
@@ -7828,7 +8064,7 @@
               <w:rPr>
                 <w:sz w:val="18"/>
               </w:rPr>
-              <w:t xml:space="preserve">UC-28</w:t>
+              <w:t>UC-32</w:t>
             </w:r>
           </w:p>
         </w:tc>
@@ -7842,7 +8078,7 @@
               <w:rPr>
                 <w:sz w:val="18"/>
               </w:rPr>
-              <w:t xml:space="preserve">Post Video</w:t>
+              <w:t>Save Post</w:t>
             </w:r>
           </w:p>
         </w:tc>
@@ -7856,7 +8092,7 @@
               <w:rPr>
                 <w:sz w:val="18"/>
               </w:rPr>
-              <w:t xml:space="preserve">Trader (PREMIUM), Media Storage</w:t>
+              <w:t>Trader</w:t>
             </w:r>
           </w:p>
         </w:tc>
@@ -7870,7 +8106,7 @@
               <w:rPr>
                 <w:sz w:val="18"/>
               </w:rPr>
-              <w:t xml:space="preserve">Trader with an active PREMIUM plan publishes a video post.</w:t>
+              <w:t>Trader bookmarks a post and views saved posts.</w:t>
             </w:r>
           </w:p>
         </w:tc>
@@ -7886,7 +8122,7 @@
               <w:rPr>
                 <w:sz w:val="18"/>
               </w:rPr>
-              <w:t>UC-29</w:t>
+              <w:t>UC-33</w:t>
             </w:r>
           </w:p>
         </w:tc>
@@ -7900,7 +8136,7 @@
               <w:rPr>
                 <w:sz w:val="18"/>
               </w:rPr>
-              <w:t>Manage Own Posts</w:t>
+              <w:t>Report Post</w:t>
             </w:r>
           </w:p>
         </w:tc>
@@ -7914,7 +8150,7 @@
               <w:rPr>
                 <w:sz w:val="18"/>
               </w:rPr>
-              <w:t>Trader, Media Storage</w:t>
+              <w:t>Trader</w:t>
             </w:r>
           </w:p>
         </w:tc>
@@ -7928,7 +8164,7 @@
               <w:rPr>
                 <w:sz w:val="18"/>
               </w:rPr>
-              <w:t>Trader edits or deletes own posts.</w:t>
+              <w:t>Trader reports a post that violates community rules.</w:t>
             </w:r>
           </w:p>
         </w:tc>
@@ -7944,7 +8180,7 @@
               <w:rPr>
                 <w:sz w:val="18"/>
               </w:rPr>
-              <w:t>UC-30</w:t>
+              <w:t>UC-34</w:t>
             </w:r>
           </w:p>
         </w:tc>
@@ -7958,7 +8194,7 @@
               <w:rPr>
                 <w:sz w:val="18"/>
               </w:rPr>
-              <w:t>Comment on Post</w:t>
+              <w:t>View News Feed</w:t>
             </w:r>
           </w:p>
         </w:tc>
@@ -7972,6 +8208,296 @@
               <w:rPr>
                 <w:sz w:val="18"/>
               </w:rPr>
+              <w:t>Trader, News Source</w:t>
+            </w:r>
+          </w:p>
+        </w:tc>
+        <w:tc>
+          <w:tcPr>
+            <w:tcW w:type="dxa" w:w="3888"/>
+          </w:tcPr>
+          <w:p>
+            <w:r/>
+            <w:r>
+              <w:rPr>
+                <w:sz w:val="18"/>
+              </w:rPr>
+              <w:t>Trader reads aggregated news filtered by coin; AI summaries and sentiment are shown on PRO and PREMIUM plans.</w:t>
+            </w:r>
+          </w:p>
+        </w:tc>
+      </w:tr>
+      <w:tr>
+        <w:tc>
+          <w:tcPr>
+            <w:tcW w:type="dxa" w:w="864"/>
+          </w:tcPr>
+          <w:p>
+            <w:r/>
+            <w:r>
+              <w:rPr>
+                <w:sz w:val="18"/>
+              </w:rPr>
+              <w:t xml:space="preserve">UC-35</w:t>
+            </w:r>
+          </w:p>
+        </w:tc>
+        <w:tc>
+          <w:tcPr>
+            <w:tcW w:type="dxa" w:w="2160"/>
+          </w:tcPr>
+          <w:p>
+            <w:r/>
+            <w:r>
+              <w:rPr>
+                <w:sz w:val="18"/>
+              </w:rPr>
+              <w:t xml:space="preserve">Ask AI Assistant</w:t>
+            </w:r>
+          </w:p>
+        </w:tc>
+        <w:tc>
+          <w:tcPr>
+            <w:tcW w:type="dxa" w:w="2016"/>
+          </w:tcPr>
+          <w:p>
+            <w:r/>
+            <w:r>
+              <w:rPr>
+                <w:sz w:val="18"/>
+              </w:rPr>
+              <w:t xml:space="preserve">Trader (PRO, PREMIUM), LLM Provider</w:t>
+            </w:r>
+          </w:p>
+        </w:tc>
+        <w:tc>
+          <w:tcPr>
+            <w:tcW w:type="dxa" w:w="3888"/>
+          </w:tcPr>
+          <w:p>
+            <w:r/>
+            <w:r>
+              <w:rPr>
+                <w:sz w:val="18"/>
+              </w:rPr>
+              <w:t xml:space="preserve">Trader with a PRO or PREMIUM plan asks questions about a pair, a trading plan or, on PREMIUM, own performance and receives an explanation, within the daily quota of the plan.</w:t>
+            </w:r>
+          </w:p>
+        </w:tc>
+      </w:tr>
+      <w:tr>
+        <w:tc>
+          <w:tcPr>
+            <w:tcW w:type="dxa" w:w="864"/>
+          </w:tcPr>
+          <w:p>
+            <w:r/>
+            <w:r>
+              <w:rPr>
+                <w:sz w:val="18"/>
+              </w:rPr>
+              <w:t xml:space="preserve">UC-36</w:t>
+            </w:r>
+          </w:p>
+        </w:tc>
+        <w:tc>
+          <w:tcPr>
+            <w:tcW w:type="dxa" w:w="2160"/>
+          </w:tcPr>
+          <w:p>
+            <w:r/>
+            <w:r>
+              <w:rPr>
+                <w:sz w:val="18"/>
+              </w:rPr>
+              <w:t xml:space="preserve">Manage AI Conversations</w:t>
+            </w:r>
+          </w:p>
+        </w:tc>
+        <w:tc>
+          <w:tcPr>
+            <w:tcW w:type="dxa" w:w="2016"/>
+          </w:tcPr>
+          <w:p>
+            <w:r/>
+            <w:r>
+              <w:rPr>
+                <w:sz w:val="18"/>
+              </w:rPr>
+              <w:t xml:space="preserve">Trader</w:t>
+            </w:r>
+          </w:p>
+        </w:tc>
+        <w:tc>
+          <w:tcPr>
+            <w:tcW w:type="dxa" w:w="3888"/>
+          </w:tcPr>
+          <w:p>
+            <w:r/>
+            <w:r>
+              <w:rPr>
+                <w:sz w:val="18"/>
+              </w:rPr>
+              <w:t xml:space="preserve">Trader views, renames and deletes AI conversations; conversations remain readable after the paid plan ends.</w:t>
+            </w:r>
+          </w:p>
+        </w:tc>
+      </w:tr>
+      <w:tr>
+        <w:tc>
+          <w:tcPr>
+            <w:tcW w:type="dxa" w:w="864"/>
+          </w:tcPr>
+          <w:p>
+            <w:r/>
+            <w:r>
+              <w:rPr>
+                <w:sz w:val="18"/>
+              </w:rPr>
+              <w:t xml:space="preserve">UC-37</w:t>
+            </w:r>
+          </w:p>
+        </w:tc>
+        <w:tc>
+          <w:tcPr>
+            <w:tcW w:type="dxa" w:w="2160"/>
+          </w:tcPr>
+          <w:p>
+            <w:r/>
+            <w:r>
+              <w:rPr>
+                <w:sz w:val="18"/>
+              </w:rPr>
+              <w:t xml:space="preserve">View Subscription Plans</w:t>
+            </w:r>
+          </w:p>
+        </w:tc>
+        <w:tc>
+          <w:tcPr>
+            <w:tcW w:type="dxa" w:w="2016"/>
+          </w:tcPr>
+          <w:p>
+            <w:r/>
+            <w:r>
+              <w:rPr>
+                <w:sz w:val="18"/>
+              </w:rPr>
+              <w:t xml:space="preserve">Trader</w:t>
+            </w:r>
+          </w:p>
+        </w:tc>
+        <w:tc>
+          <w:tcPr>
+            <w:tcW w:type="dxa" w:w="3888"/>
+          </w:tcPr>
+          <w:p>
+            <w:r/>
+            <w:r>
+              <w:rPr>
+                <w:sz w:val="18"/>
+              </w:rPr>
+              <w:t xml:space="preserve">Trader compares the FREE, PRO and PREMIUM plans, the packages for sale and the current and scheduled subscriptions.</w:t>
+            </w:r>
+          </w:p>
+        </w:tc>
+      </w:tr>
+      <w:tr>
+        <w:tc>
+          <w:tcPr>
+            <w:tcW w:type="dxa" w:w="864"/>
+          </w:tcPr>
+          <w:p>
+            <w:r/>
+            <w:r>
+              <w:rPr>
+                <w:sz w:val="18"/>
+              </w:rPr>
+              <w:t>UC-38</w:t>
+            </w:r>
+          </w:p>
+        </w:tc>
+        <w:tc>
+          <w:tcPr>
+            <w:tcW w:type="dxa" w:w="2160"/>
+          </w:tcPr>
+          <w:p>
+            <w:r/>
+            <w:r>
+              <w:rPr>
+                <w:sz w:val="18"/>
+              </w:rPr>
+              <w:t>Purchase Subscription</w:t>
+            </w:r>
+          </w:p>
+        </w:tc>
+        <w:tc>
+          <w:tcPr>
+            <w:tcW w:type="dxa" w:w="2016"/>
+          </w:tcPr>
+          <w:p>
+            <w:r/>
+            <w:r>
+              <w:rPr>
+                <w:sz w:val="18"/>
+              </w:rPr>
+              <w:t>Trader, Payment Gateway, Email Service</w:t>
+            </w:r>
+          </w:p>
+        </w:tc>
+        <w:tc>
+          <w:tcPr>
+            <w:tcW w:type="dxa" w:w="3888"/>
+          </w:tcPr>
+          <w:p>
+            <w:r/>
+            <w:r>
+              <w:rPr>
+                <w:sz w:val="18"/>
+              </w:rPr>
+              <w:t>Trader buys a new, renewal, upgrade or lower-tier package through VNPay or MoMo; an upgrade is charged the package price less the unused value of the current subscriptions. The subscription is activated or scheduled on confirmed payment.</w:t>
+            </w:r>
+          </w:p>
+        </w:tc>
+      </w:tr>
+      <w:tr>
+        <w:tc>
+          <w:tcPr>
+            <w:tcW w:type="dxa" w:w="864"/>
+          </w:tcPr>
+          <w:p>
+            <w:r/>
+            <w:r>
+              <w:rPr>
+                <w:sz w:val="18"/>
+              </w:rPr>
+              <w:t>UC-39</w:t>
+            </w:r>
+          </w:p>
+        </w:tc>
+        <w:tc>
+          <w:tcPr>
+            <w:tcW w:type="dxa" w:w="2160"/>
+          </w:tcPr>
+          <w:p>
+            <w:r/>
+            <w:r>
+              <w:rPr>
+                <w:sz w:val="18"/>
+              </w:rPr>
+              <w:t>View Payment History</w:t>
+            </w:r>
+          </w:p>
+        </w:tc>
+        <w:tc>
+          <w:tcPr>
+            <w:tcW w:type="dxa" w:w="2016"/>
+          </w:tcPr>
+          <w:p>
+            <w:r/>
+            <w:r>
+              <w:rPr>
+                <w:sz w:val="18"/>
+              </w:rPr>
               <w:t>Trader</w:t>
             </w:r>
           </w:p>
@@ -7986,7 +8512,7 @@
               <w:rPr>
                 <w:sz w:val="18"/>
               </w:rPr>
-              <w:t>Trader comments on a post or replies to a comment, and edits or deletes own comments.</w:t>
+              <w:t>Trader views own subscription orders and their status.</w:t>
             </w:r>
           </w:p>
         </w:tc>
@@ -8002,7 +8528,7 @@
               <w:rPr>
                 <w:sz w:val="18"/>
               </w:rPr>
-              <w:t>UC-31</w:t>
+              <w:t>UC-40</w:t>
             </w:r>
           </w:p>
         </w:tc>
@@ -8016,7 +8542,7 @@
               <w:rPr>
                 <w:sz w:val="18"/>
               </w:rPr>
-              <w:t>React to Content</w:t>
+              <w:t>View Admin Dashboard</w:t>
             </w:r>
           </w:p>
         </w:tc>
@@ -8030,7 +8556,7 @@
               <w:rPr>
                 <w:sz w:val="18"/>
               </w:rPr>
-              <w:t>Trader</w:t>
+              <w:t>Admin</w:t>
             </w:r>
           </w:p>
         </w:tc>
@@ -8044,7 +8570,7 @@
               <w:rPr>
                 <w:sz w:val="18"/>
               </w:rPr>
-              <w:t>Trader likes or unlikes a post or a comment.</w:t>
+              <w:t>Admin views key indicators on users, revenue, reports, AI usage and data ingestion status.</w:t>
             </w:r>
           </w:p>
         </w:tc>
@@ -8060,7 +8586,7 @@
               <w:rPr>
                 <w:sz w:val="18"/>
               </w:rPr>
-              <w:t>UC-32</w:t>
+              <w:t>UC-41</w:t>
             </w:r>
           </w:p>
         </w:tc>
@@ -8074,7 +8600,7 @@
               <w:rPr>
                 <w:sz w:val="18"/>
               </w:rPr>
-              <w:t>Save Post</w:t>
+              <w:t>Generate Management Report</w:t>
             </w:r>
           </w:p>
         </w:tc>
@@ -8088,7 +8614,7 @@
               <w:rPr>
                 <w:sz w:val="18"/>
               </w:rPr>
-              <w:t>Trader</w:t>
+              <w:t>Admin</w:t>
             </w:r>
           </w:p>
         </w:tc>
@@ -8102,7 +8628,7 @@
               <w:rPr>
                 <w:sz w:val="18"/>
               </w:rPr>
-              <w:t>Trader bookmarks a post and views saved posts.</w:t>
+              <w:t>Admin generates revenue and user activity reports for a period and exports them.</w:t>
             </w:r>
           </w:p>
         </w:tc>
@@ -8118,7 +8644,7 @@
               <w:rPr>
                 <w:sz w:val="18"/>
               </w:rPr>
-              <w:t>UC-33</w:t>
+              <w:t>UC-42</w:t>
             </w:r>
           </w:p>
         </w:tc>
@@ -8132,7 +8658,7 @@
               <w:rPr>
                 <w:sz w:val="18"/>
               </w:rPr>
-              <w:t>Report Post</w:t>
+              <w:t>Manage User Accounts</w:t>
             </w:r>
           </w:p>
         </w:tc>
@@ -8146,7 +8672,7 @@
               <w:rPr>
                 <w:sz w:val="18"/>
               </w:rPr>
-              <w:t>Trader</w:t>
+              <w:t>Admin</w:t>
             </w:r>
           </w:p>
         </w:tc>
@@ -8160,7 +8686,7 @@
               <w:rPr>
                 <w:sz w:val="18"/>
               </w:rPr>
-              <w:t>Trader reports a post that violates community rules.</w:t>
+              <w:t>Admin searches accounts, locks, unlocks or bans them and assigns roles.</w:t>
             </w:r>
           </w:p>
         </w:tc>
@@ -8176,7 +8702,7 @@
               <w:rPr>
                 <w:sz w:val="18"/>
               </w:rPr>
-              <w:t>UC-34</w:t>
+              <w:t>UC-43</w:t>
             </w:r>
           </w:p>
         </w:tc>
@@ -8190,7 +8716,7 @@
               <w:rPr>
                 <w:sz w:val="18"/>
               </w:rPr>
-              <w:t>View News Feed</w:t>
+              <w:t>Moderate Reported Posts</w:t>
             </w:r>
           </w:p>
         </w:tc>
@@ -8204,7 +8730,7 @@
               <w:rPr>
                 <w:sz w:val="18"/>
               </w:rPr>
-              <w:t>Trader, News Source</w:t>
+              <w:t>Admin</w:t>
             </w:r>
           </w:p>
         </w:tc>
@@ -8218,7 +8744,7 @@
               <w:rPr>
                 <w:sz w:val="18"/>
               </w:rPr>
-              <w:t>Trader reads aggregated news filtered by coin; AI summaries and sentiment are shown on PRO and PREMIUM plans.</w:t>
+              <w:t>Admin reviews reported posts and hides content, dismisses reports, warns or bans users.</w:t>
             </w:r>
           </w:p>
         </w:tc>
@@ -8234,7 +8760,7 @@
               <w:rPr>
                 <w:sz w:val="18"/>
               </w:rPr>
-              <w:t xml:space="preserve">UC-35</w:t>
+              <w:t>UC-44</w:t>
             </w:r>
           </w:p>
         </w:tc>
@@ -8248,7 +8774,7 @@
               <w:rPr>
                 <w:sz w:val="18"/>
               </w:rPr>
-              <w:t xml:space="preserve">Ask AI Assistant</w:t>
+              <w:t>Publish Official Announcement</w:t>
             </w:r>
           </w:p>
         </w:tc>
@@ -8262,7 +8788,7 @@
               <w:rPr>
                 <w:sz w:val="18"/>
               </w:rPr>
-              <w:t xml:space="preserve">Trader (PRO, PREMIUM), LLM Provider</w:t>
+              <w:t>Admin, Media Storage</w:t>
             </w:r>
           </w:p>
         </w:tc>
@@ -8276,529 +8802,7 @@
               <w:rPr>
                 <w:sz w:val="18"/>
               </w:rPr>
-              <w:t xml:space="preserve">Trader with a PRO or PREMIUM plan asks questions about a pair, a trading plan or, on PREMIUM, own performance and receives an explanation, within the daily quota of the plan.</w:t>
-            </w:r>
-          </w:p>
-        </w:tc>
-      </w:tr>
-      <w:tr>
-        <w:tc>
-          <w:tcPr>
-            <w:tcW w:type="dxa" w:w="864"/>
-          </w:tcPr>
-          <w:p>
-            <w:r/>
-            <w:r>
-              <w:rPr>
-                <w:sz w:val="18"/>
-              </w:rPr>
-              <w:t xml:space="preserve">UC-36</w:t>
-            </w:r>
-          </w:p>
-        </w:tc>
-        <w:tc>
-          <w:tcPr>
-            <w:tcW w:type="dxa" w:w="2160"/>
-          </w:tcPr>
-          <w:p>
-            <w:r/>
-            <w:r>
-              <w:rPr>
-                <w:sz w:val="18"/>
-              </w:rPr>
-              <w:t xml:space="preserve">Manage AI Conversations</w:t>
-            </w:r>
-          </w:p>
-        </w:tc>
-        <w:tc>
-          <w:tcPr>
-            <w:tcW w:type="dxa" w:w="2016"/>
-          </w:tcPr>
-          <w:p>
-            <w:r/>
-            <w:r>
-              <w:rPr>
-                <w:sz w:val="18"/>
-              </w:rPr>
-              <w:t xml:space="preserve">Trader</w:t>
-            </w:r>
-          </w:p>
-        </w:tc>
-        <w:tc>
-          <w:tcPr>
-            <w:tcW w:type="dxa" w:w="3888"/>
-          </w:tcPr>
-          <w:p>
-            <w:r/>
-            <w:r>
-              <w:rPr>
-                <w:sz w:val="18"/>
-              </w:rPr>
-              <w:t xml:space="preserve">Trader views, renames and deletes AI conversations; conversations remain readable after the paid plan ends.</w:t>
-            </w:r>
-          </w:p>
-        </w:tc>
-      </w:tr>
-      <w:tr>
-        <w:tc>
-          <w:tcPr>
-            <w:tcW w:type="dxa" w:w="864"/>
-          </w:tcPr>
-          <w:p>
-            <w:r/>
-            <w:r>
-              <w:rPr>
-                <w:sz w:val="18"/>
-              </w:rPr>
-              <w:t xml:space="preserve">UC-37</w:t>
-            </w:r>
-          </w:p>
-        </w:tc>
-        <w:tc>
-          <w:tcPr>
-            <w:tcW w:type="dxa" w:w="2160"/>
-          </w:tcPr>
-          <w:p>
-            <w:r/>
-            <w:r>
-              <w:rPr>
-                <w:sz w:val="18"/>
-              </w:rPr>
-              <w:t xml:space="preserve">View Subscription Plans</w:t>
-            </w:r>
-          </w:p>
-        </w:tc>
-        <w:tc>
-          <w:tcPr>
-            <w:tcW w:type="dxa" w:w="2016"/>
-          </w:tcPr>
-          <w:p>
-            <w:r/>
-            <w:r>
-              <w:rPr>
-                <w:sz w:val="18"/>
-              </w:rPr>
-              <w:t xml:space="preserve">Trader</w:t>
-            </w:r>
-          </w:p>
-        </w:tc>
-        <w:tc>
-          <w:tcPr>
-            <w:tcW w:type="dxa" w:w="3888"/>
-          </w:tcPr>
-          <w:p>
-            <w:r/>
-            <w:r>
-              <w:rPr>
-                <w:sz w:val="18"/>
-              </w:rPr>
-              <w:t xml:space="preserve">Trader compares the FREE, PRO and PREMIUM plans, the packages for sale and the current and scheduled subscriptions.</w:t>
-            </w:r>
-          </w:p>
-        </w:tc>
-      </w:tr>
-      <w:tr>
-        <w:tc>
-          <w:tcPr>
-            <w:tcW w:type="dxa" w:w="864"/>
-          </w:tcPr>
-          <w:p>
-            <w:r/>
-            <w:r>
-              <w:rPr>
-                <w:sz w:val="18"/>
-              </w:rPr>
-              <w:t>UC-38</w:t>
-            </w:r>
-          </w:p>
-        </w:tc>
-        <w:tc>
-          <w:tcPr>
-            <w:tcW w:type="dxa" w:w="2160"/>
-          </w:tcPr>
-          <w:p>
-            <w:r/>
-            <w:r>
-              <w:rPr>
-                <w:sz w:val="18"/>
-              </w:rPr>
-              <w:t>Purchase Subscription</w:t>
-            </w:r>
-          </w:p>
-        </w:tc>
-        <w:tc>
-          <w:tcPr>
-            <w:tcW w:type="dxa" w:w="2016"/>
-          </w:tcPr>
-          <w:p>
-            <w:r/>
-            <w:r>
-              <w:rPr>
-                <w:sz w:val="18"/>
-              </w:rPr>
-              <w:t>Trader, Payment Gateway, Email Service</w:t>
-            </w:r>
-          </w:p>
-        </w:tc>
-        <w:tc>
-          <w:tcPr>
-            <w:tcW w:type="dxa" w:w="3888"/>
-          </w:tcPr>
-          <w:p>
-            <w:r/>
-            <w:r>
-              <w:rPr>
-                <w:sz w:val="18"/>
-              </w:rPr>
-              <w:t>Trader buys a new, renewal, upgrade or lower-tier package through VNPay or MoMo; an upgrade is charged the package price less the unused value of the current subscriptions. The subscription is activated or scheduled on confirmed payment.</w:t>
-            </w:r>
-          </w:p>
-        </w:tc>
-      </w:tr>
-      <w:tr>
-        <w:tc>
-          <w:tcPr>
-            <w:tcW w:type="dxa" w:w="864"/>
-          </w:tcPr>
-          <w:p>
-            <w:r/>
-            <w:r>
-              <w:rPr>
-                <w:sz w:val="18"/>
-              </w:rPr>
-              <w:t>UC-39</w:t>
-            </w:r>
-          </w:p>
-        </w:tc>
-        <w:tc>
-          <w:tcPr>
-            <w:tcW w:type="dxa" w:w="2160"/>
-          </w:tcPr>
-          <w:p>
-            <w:r/>
-            <w:r>
-              <w:rPr>
-                <w:sz w:val="18"/>
-              </w:rPr>
-              <w:t>View Payment History</w:t>
-            </w:r>
-          </w:p>
-        </w:tc>
-        <w:tc>
-          <w:tcPr>
-            <w:tcW w:type="dxa" w:w="2016"/>
-          </w:tcPr>
-          <w:p>
-            <w:r/>
-            <w:r>
-              <w:rPr>
-                <w:sz w:val="18"/>
-              </w:rPr>
-              <w:t>Trader</w:t>
-            </w:r>
-          </w:p>
-        </w:tc>
-        <w:tc>
-          <w:tcPr>
-            <w:tcW w:type="dxa" w:w="3888"/>
-          </w:tcPr>
-          <w:p>
-            <w:r/>
-            <w:r>
-              <w:rPr>
-                <w:sz w:val="18"/>
-              </w:rPr>
-              <w:t>Trader views own subscription orders and their status.</w:t>
-            </w:r>
-          </w:p>
-        </w:tc>
-      </w:tr>
-      <w:tr>
-        <w:tc>
-          <w:tcPr>
-            <w:tcW w:type="dxa" w:w="864"/>
-          </w:tcPr>
-          <w:p>
-            <w:r/>
-            <w:r>
-              <w:rPr>
-                <w:sz w:val="18"/>
-              </w:rPr>
-              <w:t>UC-40</w:t>
-            </w:r>
-          </w:p>
-        </w:tc>
-        <w:tc>
-          <w:tcPr>
-            <w:tcW w:type="dxa" w:w="2160"/>
-          </w:tcPr>
-          <w:p>
-            <w:r/>
-            <w:r>
-              <w:rPr>
-                <w:sz w:val="18"/>
-              </w:rPr>
-              <w:t>View Admin Dashboard</w:t>
-            </w:r>
-          </w:p>
-        </w:tc>
-        <w:tc>
-          <w:tcPr>
-            <w:tcW w:type="dxa" w:w="2016"/>
-          </w:tcPr>
-          <w:p>
-            <w:r/>
-            <w:r>
-              <w:rPr>
-                <w:sz w:val="18"/>
-              </w:rPr>
-              <w:t>Admin</w:t>
-            </w:r>
-          </w:p>
-        </w:tc>
-        <w:tc>
-          <w:tcPr>
-            <w:tcW w:type="dxa" w:w="3888"/>
-          </w:tcPr>
-          <w:p>
-            <w:r/>
-            <w:r>
-              <w:rPr>
-                <w:sz w:val="18"/>
-              </w:rPr>
-              <w:t>Admin views key indicators on users, revenue, reports, AI usage and data ingestion status.</w:t>
-            </w:r>
-          </w:p>
-        </w:tc>
-      </w:tr>
-      <w:tr>
-        <w:tc>
-          <w:tcPr>
-            <w:tcW w:type="dxa" w:w="864"/>
-          </w:tcPr>
-          <w:p>
-            <w:r/>
-            <w:r>
-              <w:rPr>
-                <w:sz w:val="18"/>
-              </w:rPr>
-              <w:t>UC-41</w:t>
-            </w:r>
-          </w:p>
-        </w:tc>
-        <w:tc>
-          <w:tcPr>
-            <w:tcW w:type="dxa" w:w="2160"/>
-          </w:tcPr>
-          <w:p>
-            <w:r/>
-            <w:r>
-              <w:rPr>
-                <w:sz w:val="18"/>
-              </w:rPr>
-              <w:t>Generate Management Report</w:t>
-            </w:r>
-          </w:p>
-        </w:tc>
-        <w:tc>
-          <w:tcPr>
-            <w:tcW w:type="dxa" w:w="2016"/>
-          </w:tcPr>
-          <w:p>
-            <w:r/>
-            <w:r>
-              <w:rPr>
-                <w:sz w:val="18"/>
-              </w:rPr>
-              <w:t>Admin</w:t>
-            </w:r>
-          </w:p>
-        </w:tc>
-        <w:tc>
-          <w:tcPr>
-            <w:tcW w:type="dxa" w:w="3888"/>
-          </w:tcPr>
-          <w:p>
-            <w:r/>
-            <w:r>
-              <w:rPr>
-                <w:sz w:val="18"/>
-              </w:rPr>
-              <w:t>Admin generates revenue and user activity reports for a period and exports them.</w:t>
-            </w:r>
-          </w:p>
-        </w:tc>
-      </w:tr>
-      <w:tr>
-        <w:tc>
-          <w:tcPr>
-            <w:tcW w:type="dxa" w:w="864"/>
-          </w:tcPr>
-          <w:p>
-            <w:r/>
-            <w:r>
-              <w:rPr>
-                <w:sz w:val="18"/>
-              </w:rPr>
-              <w:t>UC-42</w:t>
-            </w:r>
-          </w:p>
-        </w:tc>
-        <w:tc>
-          <w:tcPr>
-            <w:tcW w:type="dxa" w:w="2160"/>
-          </w:tcPr>
-          <w:p>
-            <w:r/>
-            <w:r>
-              <w:rPr>
-                <w:sz w:val="18"/>
-              </w:rPr>
-              <w:t>Manage User Accounts</w:t>
-            </w:r>
-          </w:p>
-        </w:tc>
-        <w:tc>
-          <w:tcPr>
-            <w:tcW w:type="dxa" w:w="2016"/>
-          </w:tcPr>
-          <w:p>
-            <w:r/>
-            <w:r>
-              <w:rPr>
-                <w:sz w:val="18"/>
-              </w:rPr>
-              <w:t>Admin</w:t>
-            </w:r>
-          </w:p>
-        </w:tc>
-        <w:tc>
-          <w:tcPr>
-            <w:tcW w:type="dxa" w:w="3888"/>
-          </w:tcPr>
-          <w:p>
-            <w:r/>
-            <w:r>
-              <w:rPr>
-                <w:sz w:val="18"/>
-              </w:rPr>
-              <w:t>Admin searches accounts, locks, unlocks or bans them and assigns roles.</w:t>
-            </w:r>
-          </w:p>
-        </w:tc>
-      </w:tr>
-      <w:tr>
-        <w:tc>
-          <w:tcPr>
-            <w:tcW w:type="dxa" w:w="864"/>
-          </w:tcPr>
-          <w:p>
-            <w:r/>
-            <w:r>
-              <w:rPr>
-                <w:sz w:val="18"/>
-              </w:rPr>
-              <w:t>UC-43</w:t>
-            </w:r>
-          </w:p>
-        </w:tc>
-        <w:tc>
-          <w:tcPr>
-            <w:tcW w:type="dxa" w:w="2160"/>
-          </w:tcPr>
-          <w:p>
-            <w:r/>
-            <w:r>
-              <w:rPr>
-                <w:sz w:val="18"/>
-              </w:rPr>
-              <w:t>Moderate Reported Posts</w:t>
-            </w:r>
-          </w:p>
-        </w:tc>
-        <w:tc>
-          <w:tcPr>
-            <w:tcW w:type="dxa" w:w="2016"/>
-          </w:tcPr>
-          <w:p>
-            <w:r/>
-            <w:r>
-              <w:rPr>
-                <w:sz w:val="18"/>
-              </w:rPr>
-              <w:t>Admin</w:t>
-            </w:r>
-          </w:p>
-        </w:tc>
-        <w:tc>
-          <w:tcPr>
-            <w:tcW w:type="dxa" w:w="3888"/>
-          </w:tcPr>
-          <w:p>
-            <w:r/>
-            <w:r>
-              <w:rPr>
-                <w:sz w:val="18"/>
-              </w:rPr>
-              <w:t>Admin reviews reported posts and hides content, dismisses reports, warns or bans users.</w:t>
-            </w:r>
-          </w:p>
-        </w:tc>
-      </w:tr>
-      <w:tr>
-        <w:tc>
-          <w:tcPr>
-            <w:tcW w:type="dxa" w:w="864"/>
-          </w:tcPr>
-          <w:p>
-            <w:r/>
-            <w:r>
-              <w:rPr>
-                <w:sz w:val="18"/>
-              </w:rPr>
-              <w:t>UC-44</w:t>
-            </w:r>
-          </w:p>
-        </w:tc>
-        <w:tc>
-          <w:tcPr>
-            <w:tcW w:type="dxa" w:w="2160"/>
-          </w:tcPr>
-          <w:p>
-            <w:r/>
-            <w:r>
-              <w:rPr>
-                <w:sz w:val="18"/>
-              </w:rPr>
-              <w:t>Publish Official Announcement</w:t>
-            </w:r>
-          </w:p>
-        </w:tc>
-        <w:tc>
-          <w:tcPr>
-            <w:tcW w:type="dxa" w:w="2016"/>
-          </w:tcPr>
-          <w:p>
-            <w:r/>
-            <w:r>
-              <w:rPr>
-                <w:sz w:val="18"/>
-              </w:rPr>
-              <w:t>Admin, Media Storage</w:t>
-            </w:r>
-          </w:p>
-        </w:tc>
-        <w:tc>
-          <w:tcPr>
-            <w:tcW w:type="dxa" w:w="3888"/>
-          </w:tcPr>
-          <w:p>
-            <w:r/>
-            <w:r>
-              <w:rPr>
-                <w:sz w:val="18"/>
-              </w:rPr>
-              <w:t>Admin publishes a pinned official post to the community.</w:t>
+              <w:t xml:space="preserve">Admin publishes a pinned official post to the community: an announcement, a platform update or educational content.</w:t>
             </w:r>
           </w:p>
         </w:tc>
@@ -10908,7 +10912,7 @@
               <w:rPr>
                 <w:sz w:val="18"/>
               </w:rPr>
-              <w:t>Tabs Latest, Most Liked, Saved, My Posts; filters by coin and market; pinned official announcements.</w:t>
+              <w:t xml:space="preserve">Tabs Latest, Most Liked, Saved, My Posts; filters by coin, market and author; text search; pinned official announcements by category. Guests read it.</w:t>
             </w:r>
           </w:p>
         </w:tc>
@@ -12720,6 +12724,7 @@
               <w:rPr>
                 <w:sz w:val="18"/>
               </w:rPr>
+              <w:t>Read</w:t>
             </w:r>
           </w:p>
         </w:tc>
@@ -12785,7 +12790,7 @@
               <w:rPr>
                 <w:sz w:val="18"/>
               </w:rPr>
-              <w:t xml:space="preserve">   Activity: Post Video (SCR-26), PREMIUM only</w:t>
+              <w:t xml:space="preserve">   Activity: Post Video (SCR-26), PRO and PREMIUM</w:t>
             </w:r>
           </w:p>
         </w:tc>
@@ -16636,7 +16641,7 @@
               <w:rPr>
                 <w:sz w:val="18"/>
               </w:rPr>
-              <w:t>Community post (text or video) with market type, status and official flag.</w:t>
+              <w:t xml:space="preserve">Community post (text or video) with market type, status, official flag and official category (ANNOUNCEMENT, PLATFORM_UPDATE, EDUCATION).</w:t>
             </w:r>
           </w:p>
         </w:tc>
@@ -20538,7 +20543,7 @@
         <w:rPr>
           <w:i w:val="0"/>
         </w:rPr>
-        <w:t>Trader opens "Community" in the main menu, or a post link from a notification.</w:t>
+        <w:t xml:space="preserve">Guest or Trader opens "Community" in the main menu, a post link from a notification, the community link of a coin or the name of an author.</w:t>
       </w:r>
     </w:p>
     <w:p>
@@ -20555,7 +20560,7 @@
         <w:rPr>
           <w:i w:val="0"/>
         </w:rPr>
-        <w:t>Displays community posts and their discussions (UC-26).</w:t>
+        <w:t xml:space="preserve">Displays community posts, their discussions, the community discussion of a coin and member pages (UC-26).</w:t>
       </w:r>
     </w:p>
     <w:p>
@@ -20601,7 +20606,7 @@
         <w:spacing w:after="60"/>
       </w:pPr>
       <w:r>
-        <w:t>Tabs: Latest, Most Liked (last 7 days), Saved (own bookmarks), My Posts. Filters by coin tag and market type. Official announcements are pinned at the top (BR-61).</w:t>
+        <w:t xml:space="preserve">Tabs: Latest, Most Liked (last 7 days), Saved (own bookmarks), My Posts. Filters by coin tag, market type and author. A text search of 2-100 characters matches titles and contents (MSG15 otherwise). Official announcements are pinned at the top and can be filtered by category (BR-61). A Guest reads the Latest and Most Liked tabs, the pinned posts, a post and its comments; Saved, My Posts and every write need a Trader (MSG44).</w:t>
       </w:r>
     </w:p>
     <w:p>
@@ -20627,7 +20632,7 @@
         <w:spacing w:after="60"/>
       </w:pPr>
       <w:r>
-        <w:t>SCR-25 shows the full content and media, like and save buttons, and comments ordered oldest first with replies indented one level.</w:t>
+        <w:t xml:space="preserve">SCR-25 shows the full content and media, like and save buttons, and comments ordered oldest first with replies indented one level. Selecting an author opens the member page: display name, avatar, join date, number of published posts and likes received; the page of a banned member shows MSG41. For a coin the system shows the number of published posts tagged with it in the last 24 hours, in the last 7 days and in total, and the time of the latest post.</w:t>
       </w:r>
     </w:p>
     <w:p>
@@ -20728,7 +20733,7 @@
         <w:spacing w:after="60"/>
       </w:pPr>
       <w:r>
-        <w:t>Posting a video requires an active PREMIUM plan (BR-43, BR-62); otherwise MSG29 is shown.</w:t>
+        <w:t xml:space="preserve">Posting a video requires an active PRO or PREMIUM plan (BR-43, BR-62); otherwise MSG29 is shown.</w:t>
       </w:r>
     </w:p>
     <w:p>
@@ -20767,7 +20772,7 @@
         <w:spacing w:after="60"/>
       </w:pPr>
       <w:r>
-        <w:t>Only Admin can set is_official; official posts are pinned in the feed (BR-61).</w:t>
+        <w:t xml:space="preserve">Only Admin can set is_official and the official category ANNOUNCEMENT, PLATFORM_UPDATE or EDUCATION; official posts are pinned in the feed (BR-61).</w:t>
       </w:r>
     </w:p>
     <w:p>
@@ -22569,7 +22574,7 @@
               <w:rPr>
                 <w:sz w:val="18"/>
               </w:rPr>
-              <w:t xml:space="preserve">No</w:t>
+              <w:t xml:space="preserve">Yes</w:t>
             </w:r>
           </w:p>
         </w:tc>
@@ -27179,7 +27184,7 @@
               <w:rPr>
                 <w:sz w:val="18"/>
               </w:rPr>
-              <w:t>Posting requires a Trader account; posting a video requires the PREMIUM plan. After the plan ends or changes to a plan without video posting, existing videos remain visible but new videos cannot be posted.</w:t>
+              <w:t xml:space="preserve">Posting requires a Trader account; posting a video requires a plan with video posting (PRO or PREMIUM). After the plan ends or changes to a plan without video posting, existing videos remain visible but new videos cannot be posted.</w:t>
             </w:r>
           </w:p>
         </w:tc>
@@ -27719,7 +27724,7 @@
               <w:rPr>
                 <w:sz w:val="18"/>
               </w:rPr>
-              <w:t>Only Admin can publish official announcements; official posts are pinned at the top of the community feed.</w:t>
+              <w:t xml:space="preserve">Only Admin can publish official posts, each with a category: ANNOUNCEMENT, PLATFORM_UPDATE or EDUCATION; official posts are pinned at the top of the community feed.</w:t>
             </w:r>
           </w:p>
         </w:tc>
@@ -27749,7 +27754,7 @@
               <w:rPr>
                 <w:sz w:val="18"/>
               </w:rPr>
-              <w:t xml:space="preserve">Plan entitlements (default values of Table 3.1, maintained per tier in SCR-39). FREE: Spot analysis, total setup score only, 3 ACTIVE plans and open positions, 5 watchlist items, 3 active price alerts on the Spot market with in-app delivery, basic performance statistics, news titles and excerpts, no AI Assistant, no video posting. PRO: adds Futures analysis, Futures plans and Futures alerts, setup score components, unlimited ACTIVE plans and positions, 50 watchlist items, 20 active alerts including indicator alerts, email and push alert delivery, the full performance dashboard, news AI summary and sentiment, 30 AI questions per day. PREMIUM: as PRO with 100 watchlist items, 50 active alerts, 100 AI questions per day with the own performance context and video posting. The effective plan is the tier of the ACTIVE subscription, or FREE when none exists; entitlements are checked at request time. All packages of one tier have the same entitlements; exactly one FREE package exists, with price 0, no duration and not purchasable.</w:t>
+              <w:t xml:space="preserve">Plan entitlements (default values of Table 3.1, maintained per tier in SCR-39). FREE: Spot analysis, total setup score only, 3 ACTIVE plans and open positions, 5 watchlist items, 3 active price alerts on the Spot market with in-app delivery, basic performance statistics, news titles and excerpts, no AI Assistant, no video posting. PRO: adds Futures analysis, Futures plans and Futures alerts, setup score components, unlimited ACTIVE plans and positions, 50 watchlist items, 20 active alerts including indicator alerts, email and push alert delivery, the full performance dashboard, news AI summary and sentiment, 30 AI questions per day, video posting. PREMIUM: as PRO with 100 watchlist items, 50 active alerts, 100 AI questions per day with the own performance context. The effective plan is the tier of the ACTIVE subscription, or FREE when none exists; entitlements are checked at request time. All packages of one tier have the same entitlements; exactly one FREE package exists, with price 0, no duration and not purchasable.</w:t>
             </w:r>
           </w:p>
         </w:tc>
@@ -33353,7 +33358,7 @@
               <w:rPr>
                 <w:sz w:val="18"/>
               </w:rPr>
-              <w:t>Included; FORUM_POST has attribute is_official (BR-61).</w:t>
+              <w:t xml:space="preserve">Included; FORUM_POST has attributes is_official and official_category (BR-61).</w:t>
             </w:r>
           </w:p>
         </w:tc>

</xml_diff>

<commit_message>
docs: edits keep moderation evidence media (A-47, round 3)
SRS 3.7.2: an edit cannot remove the media of a hidden or reported post.
A-47: text-only edit limit, retention without time limit, report/delete race
as a known limit. TD: PUT answers MSG32, REMOVE_POST in the decision list.
CURRENT_STATE: PR #63 review fixes round 3.
</commit_message>
<xml_diff>
--- a/docs/srs/CryptoPilot_Report3_SRS_v1.0.docx
+++ b/docs/srs/CryptoPilot_Report3_SRS_v1.0.docx
@@ -459,7 +459,7 @@
               <w:rPr>
                 <w:sz w:val="19"/>
               </w:rPr>
-              <w:t>3.7.2, 3.11.3 and BR-47: a HIDDEN post cannot be edited by its author; the media of a hidden or reported post is kept as moderation evidence; REMOVE_POST decision added (registered topic: hide or remove inappropriate content).</w:t>
+              <w:t>3.7.2, 3.11.3 and BR-47: a HIDDEN post cannot be edited by its author, and an edit cannot remove the media of a hidden or reported post; the media of a hidden or reported post is kept as moderation evidence; REMOVE_POST decision added (registered topic: hide or remove inappropriate content).</w:t>
             </w:r>
           </w:p>
         </w:tc>
@@ -20759,7 +20759,7 @@
         <w:spacing w:after="60"/>
       </w:pPr>
       <w:r>
-        <w:t>The author can edit an own post while it is neither HIDDEN nor DELETED, and delete it while it is not DELETED. Deletion is a soft delete (BR-47) and a Media Deletion Request is sent for its media, unless the post is HIDDEN or has a report that is OPEN, REVIEWING or resolved with HIDE_POST, REMOVE_POST or BAN_USER: those files are kept as the evidence of the moderation (BR-47).</w:t>
+        <w:t>The author can edit an own post while it is neither HIDDEN nor DELETED, and delete it while it is not DELETED. An edit of a post whose media is kept as the evidence of the moderation (see below) cannot remove any of its media (MSG32); its title, content, coin tags and market type can still change and media can be added. Deletion is a soft delete (BR-47) and a Media Deletion Request is sent for its media, unless the post is HIDDEN or has a report that is OPEN, REVIEWING or resolved with HIDE_POST, REMOVE_POST or BAN_USER: those files are kept as the evidence of the moderation (BR-47).</w:t>
       </w:r>
     </w:p>
     <w:p>

</xml_diff>

<commit_message>
docs: MSG56 for media kept as moderation evidence (A-49, round 4)
SRS 5.3 gains MSG56 and 3.7.2 names it instead of MSG32; A-47 and new A-49;
TD PUT /posts/{id}; community plan error table. CURRENT_STATE: PR #63 review
fixes round 4.
</commit_message>
<xml_diff>
--- a/docs/srs/CryptoPilot_Report3_SRS_v1.0.docx
+++ b/docs/srs/CryptoPilot_Report3_SRS_v1.0.docx
@@ -459,7 +459,7 @@
               <w:rPr>
                 <w:sz w:val="19"/>
               </w:rPr>
-              <w:t>3.7.2, 3.11.3 and BR-47: a HIDDEN post cannot be edited by its author, and an edit cannot remove the media of a hidden or reported post; the media of a hidden or reported post is kept as moderation evidence; REMOVE_POST decision added (registered topic: hide or remove inappropriate content).</w:t>
+              <w:t>3.7.2, 3.11.3 and BR-47: a HIDDEN post cannot be edited by its author, and an edit cannot remove the media of a hidden or reported post (new message MSG56); the media of a hidden or reported post is kept as moderation evidence; REMOVE_POST decision added (registered topic: hide or remove inappropriate content).</w:t>
             </w:r>
           </w:p>
         </w:tc>
@@ -20759,7 +20759,7 @@
         <w:spacing w:after="60"/>
       </w:pPr>
       <w:r>
-        <w:t>The author can edit an own post while it is neither HIDDEN nor DELETED, and delete it while it is not DELETED. An edit of a post whose media is kept as the evidence of the moderation (see below) cannot remove any of its media (MSG32); its title, content, coin tags and market type can still change and media can be added. Deletion is a soft delete (BR-47) and a Media Deletion Request is sent for its media, unless the post is HIDDEN or has a report that is OPEN, REVIEWING or resolved with HIDE_POST, REMOVE_POST or BAN_USER: those files are kept as the evidence of the moderation (BR-47).</w:t>
+        <w:t>The author can edit an own post while it is neither HIDDEN nor DELETED, and delete it while it is not DELETED. An edit of a post whose media is kept as the evidence of the moderation (see below) cannot remove any of its media (MSG56); its title, content, coin tags and market type can still change and media can be added. Deletion is a soft delete (BR-47) and a Media Deletion Request is sent for its media, unless the post is HIDDEN or has a report that is OPEN, REVIEWING or resolved with HIDE_POST, REMOVE_POST or BAN_USER: those files are kept as the evidence of the moderation (BR-47).</w:t>
       </w:r>
     </w:p>
     <w:p>
@@ -32492,6 +32492,81 @@
                 <w:sz w:val="17"/>
               </w:rPr>
               <w:t xml:space="preserve">{pair} entry filled with a setup score of {scoreAtFill}, down from {scoreAtPlan} when planned.</w:t>
+            </w:r>
+          </w:p>
+        </w:tc>
+      </w:tr>
+      <w:tr>
+        <w:tc>
+          <w:tcPr>
+            <w:tcW w:type="dxa" w:w="504"/>
+          </w:tcPr>
+          <w:p>
+            <w:pPr>
+              <w:jc w:val="center"/>
+            </w:pPr>
+            <w:r/>
+            <w:r>
+              <w:rPr>
+                <w:sz w:val="17"/>
+              </w:rPr>
+              <w:t xml:space="preserve">56</w:t>
+            </w:r>
+          </w:p>
+        </w:tc>
+        <w:tc>
+          <w:tcPr>
+            <w:tcW w:type="dxa" w:w="1080"/>
+          </w:tcPr>
+          <w:p>
+            <w:r/>
+            <w:r>
+              <w:rPr>
+                <w:sz w:val="17"/>
+              </w:rPr>
+              <w:t xml:space="preserve">MSG56</w:t>
+            </w:r>
+          </w:p>
+        </w:tc>
+        <w:tc>
+          <w:tcPr>
+            <w:tcW w:type="dxa" w:w="1728"/>
+          </w:tcPr>
+          <w:p>
+            <w:r/>
+            <w:r>
+              <w:rPr>
+                <w:sz w:val="17"/>
+              </w:rPr>
+              <w:t xml:space="preserve">In red, under the field</w:t>
+            </w:r>
+          </w:p>
+        </w:tc>
+        <w:tc>
+          <w:tcPr>
+            <w:tcW w:type="dxa" w:w="2304"/>
+          </w:tcPr>
+          <w:p>
+            <w:r/>
+            <w:r>
+              <w:rPr>
+                <w:sz w:val="17"/>
+              </w:rPr>
+              <w:t xml:space="preserve">Media kept for moderation (BR-47)</w:t>
+            </w:r>
+          </w:p>
+        </w:tc>
+        <w:tc>
+          <w:tcPr>
+            <w:tcW w:type="dxa" w:w="3312"/>
+          </w:tcPr>
+          <w:p>
+            <w:r/>
+            <w:r>
+              <w:rPr>
+                <w:sz w:val="17"/>
+              </w:rPr>
+              <w:t xml:space="preserve">This post is under moderation review, so its images and videos cannot be removed. You can still edit the text or add media.</w:t>
             </w:r>
           </w:p>
         </w:tc>

</xml_diff>

<commit_message>
docs(srs): add MSG50 and align the rate limits (A-42, Q-66)
SRS 5.3 gains the MSG50 row of A-42, so MSG01...MSG56 has no gap; 4.2.4 names
MSG50 and lists the public auth and Guest limits of D-82 and D-99. A-42 done,
Q-66 answered for the team lead to confirm.
</commit_message>
<xml_diff>
--- a/docs/srs/CryptoPilot_Report3_SRS_v1.0.docx
+++ b/docs/srs/CryptoPilot_Report3_SRS_v1.0.docx
@@ -528,6 +528,70 @@
           </w:p>
         </w:tc>
       </w:tr>
+      <w:tr>
+        <w:tc>
+          <w:tcPr>
+            <w:tcW w:type="dxa" w:w="1440"/>
+          </w:tcPr>
+          <w:p>
+            <w:pPr>
+              <w:jc w:val="center"/>
+            </w:pPr>
+            <w:r/>
+            <w:r>
+              <w:rPr>
+                <w:sz w:val="19"/>
+              </w:rPr>
+              <w:t xml:space="preserve">22/10/2026</w:t>
+            </w:r>
+          </w:p>
+        </w:tc>
+        <w:tc>
+          <w:tcPr>
+            <w:tcW w:type="dxa" w:w="1152"/>
+          </w:tcPr>
+          <w:p>
+            <w:pPr>
+              <w:jc w:val="center"/>
+            </w:pPr>
+            <w:r/>
+            <w:r>
+              <w:rPr>
+                <w:sz w:val="19"/>
+              </w:rPr>
+              <w:t xml:space="preserve">A</w:t>
+            </w:r>
+          </w:p>
+        </w:tc>
+        <w:tc>
+          <w:tcPr>
+            <w:tcW w:type="dxa" w:w="1872"/>
+          </w:tcPr>
+          <w:p>
+            <w:r/>
+            <w:r>
+              <w:rPr>
+                <w:sz w:val="19"/>
+              </w:rPr>
+              <w:t xml:space="preserve">CryptoPilot Team</w:t>
+            </w:r>
+          </w:p>
+        </w:tc>
+        <w:tc>
+          <w:tcPr>
+            <w:tcW w:type="dxa" w:w="4464"/>
+          </w:tcPr>
+          <w:p>
+            <w:r/>
+            <w:r>
+              <w:rPr>
+                <w:sz w:val="19"/>
+              </w:rPr>
+              <w:t xml:space="preserve">MSG50 added for the rate limits (A-42, Q-66); the rate limiting requirement (4.2.4) names it and lists the public authentication and Guest limits (D-82, D-99). A repeated report keeps MSG34 (already reported).</w:t>
+            </w:r>
+          </w:p>
+        </w:tc>
+      </w:tr>
     </w:tbl>
     <w:p>
       <w:pPr>
@@ -25692,7 +25756,7 @@
         <w:spacing w:after="60"/>
       </w:pPr>
       <w:r>
-        <w:t>Rate limiting: login 10 requests per minute per IP address; general API 120 requests per minute per user; AI Assistant 10 requests per minute per user.</w:t>
+        <w:t>Rate limiting: login 10 requests per minute per IP address; other public authentication requests 20 per minute per IP address; general API 120 requests per minute per user; requests without an account (Guests reading market data and the community) 300 per minute per IP address; AI Assistant 10 requests per minute per user. A request beyond a limit is refused with MSG50.</w:t>
       </w:r>
     </w:p>
     <w:p>
@@ -32117,6 +32181,81 @@
                 <w:sz w:val="17"/>
               </w:rPr>
               <w:t xml:space="preserve">Your plan is now {plan}. {n} alerts have been paused because of the plan limits.</w:t>
+            </w:r>
+          </w:p>
+        </w:tc>
+      </w:tr>
+      <w:tr>
+        <w:tc>
+          <w:tcPr>
+            <w:tcW w:type="dxa" w:w="504"/>
+          </w:tcPr>
+          <w:p>
+            <w:pPr>
+              <w:jc w:val="center"/>
+            </w:pPr>
+            <w:r/>
+            <w:r>
+              <w:rPr>
+                <w:sz w:val="17"/>
+              </w:rPr>
+              <w:t xml:space="preserve">50</w:t>
+            </w:r>
+          </w:p>
+        </w:tc>
+        <w:tc>
+          <w:tcPr>
+            <w:tcW w:type="dxa" w:w="1080"/>
+          </w:tcPr>
+          <w:p>
+            <w:r/>
+            <w:r>
+              <w:rPr>
+                <w:sz w:val="17"/>
+              </w:rPr>
+              <w:t xml:space="preserve">MSG50</w:t>
+            </w:r>
+          </w:p>
+        </w:tc>
+        <w:tc>
+          <w:tcPr>
+            <w:tcW w:type="dxa" w:w="1728"/>
+          </w:tcPr>
+          <w:p>
+            <w:r/>
+            <w:r>
+              <w:rPr>
+                <w:sz w:val="17"/>
+              </w:rPr>
+              <w:t xml:space="preserve">Error banner</w:t>
+            </w:r>
+          </w:p>
+        </w:tc>
+        <w:tc>
+          <w:tcPr>
+            <w:tcW w:type="dxa" w:w="2304"/>
+          </w:tcPr>
+          <w:p>
+            <w:r/>
+            <w:r>
+              <w:rPr>
+                <w:sz w:val="17"/>
+              </w:rPr>
+              <w:t xml:space="preserve">Too many requests (rate limiting, 4.2.4)</w:t>
+            </w:r>
+          </w:p>
+        </w:tc>
+        <w:tc>
+          <w:tcPr>
+            <w:tcW w:type="dxa" w:w="3312"/>
+          </w:tcPr>
+          <w:p>
+            <w:r/>
+            <w:r>
+              <w:rPr>
+                <w:sz w:val="17"/>
+              </w:rPr>
+              <w:t xml:space="preserve">Too many requests. Please try again in {seconds} seconds.</w:t>
             </w:r>
           </w:p>
         </w:tc>

</xml_diff>

<commit_message>
docs: answer Q-71 to Q-73 and set wrong-side price message (D-112)
</commit_message>
<xml_diff>
--- a/docs/srs/CryptoPilot_Report3_SRS_v1.0.docx
+++ b/docs/srs/CryptoPilot_Report3_SRS_v1.0.docx
@@ -19763,7 +19763,7 @@
         <w:spacing w:after="60"/>
       </w:pPr>
       <w:r>
-        <w:t xml:space="preserve">Fields: pair (enabled), market (Spot or Futures according to the pair; Futures only on PRO and PREMIUM, otherwise MSG29), direction (fixed LONG for Spot, BR-21), entry type LIMIT, MARKET or STOP (BR-33), entry price (required for LIMIT; the stop price for STOP; for MARKET the current last price is shown read-only), invalidation price (optional, LIMIT and STOP, BR-68), maximum entry deviation in R (optional, BR-69), stop loss, take profit, capital (default from profile), risk % (default from profile), leverage (Futures only, integer 1 to the maximum allowed, default 1), margin mode ISOLATED (fixed, BR-26), expiry (optional, default 7 days for LIMIT), note.</w:t>
+        <w:t xml:space="preserve">Fields: pair (enabled), market (Spot or Futures according to the pair; Futures only on PRO and PREMIUM, otherwise MSG29), direction (fixed LONG for Spot, BR-21), entry type LIMIT, MARKET or STOP (BR-33), entry price (required for LIMIT; the stop price for STOP; for MARKET the current last price is shown read-only), invalidation price (optional, LIMIT and STOP, BR-68), maximum entry deviation in R (optional, BR-69), analysis timeframe (15m, 1h, 4h or 1d; required; default from the Trader's trading style: SCALPING 15m, DAY 1h, SWING and POSITION 4h, none 1h; BR-70), stop loss, take profit, capital (default from profile), risk % (default from profile), leverage (Futures only, integer 1 to the maximum allowed, default 1), margin mode ISOLATED (fixed, BR-26), expiry (optional, default 7 days for LIMIT), note.</w:t>
       </w:r>
     </w:p>
     <w:p>
@@ -20030,7 +20030,7 @@
         <w:spacing w:after="60"/>
       </w:pPr>
       <w:r>
-        <w:t xml:space="preserve">Activate (DRAFT): the system re-validates the plan with the current price and checks the limit of ACTIVE plans and open positions of the plan (BR-62, MSG27); if a BLOCKING warning exists MSG18 is shown, otherwise the plan becomes ACTIVE, activated_at is set, the snapshot is stored (BR-31) and MSG19 is shown. A MARKET plan is filled immediately at the current last price (BR-33) after the entry deviation check of BR-69 (MSG51, MSG52).</w:t>
+        <w:t xml:space="preserve">Activate (DRAFT): the system re-validates the plan with the current price and checks the limit of ACTIVE plans and open positions of the plan (BR-62, MSG27); if a BLOCKING warning exists MSG18 is shown, otherwise the plan becomes ACTIVE, activated_at is set, the snapshot is stored (BR-31) and MSG19 is shown. A MARKET plan is filled immediately at the current last price (BR-33) after the entry deviation check of BR-69 (MSG51, MSG52). Activation is refused, using the last price, when a STOP plan's stop price is already reached (MSG16 on the entry price; the plan is not changed to MARKET) or when the take profit of a LIMIT plan, the stop loss of a STOP plan or the invalidation price of a LIMIT or STOP plan is already reached (MSG16 on that field). At activation the setup score of the plan is taken (BR-70).</w:t>
       </w:r>
     </w:p>
     <w:p>
@@ -27998,7 +27998,7 @@
               <w:rPr>
                 <w:sz w:val="18"/>
               </w:rPr>
-              <w:t xml:space="preserve">Invalidation of a waiting plan: an ACTIVE LIMIT or STOP plan becomes INVALIDATED, before its entry is filled, when (a) for LIMIT the last price reaches the take profit, (b) for STOP the last price reaches the stop loss, or (c) the last price reaches the optional invalidation price. The invalidation price must lie on the other side of the current price from the entry, so that the price can reach it before the entry; it is checked when the plan is saved and when it is activated (MSG15). A MARKET plan has no invalidation price. When one 1-minute candle reaches both the entry and an invalidation level, the level that its opening price is already beyond decides; otherwise the plan is invalidated. Prices from before the activation are not used, and candles evaluated after downtime follow the same rules. An INVALIDATED or EXPIRED plan no longer counts toward the limit of ACTIVE plans (BR-62); the Trader is notified with the reason (MSG53, MSG54).</w:t>
+              <w:t xml:space="preserve">Invalidation of a waiting plan: an ACTIVE LIMIT or STOP plan becomes INVALIDATED, before its entry is filled, when (a) for LIMIT the last price reaches the take profit, (b) for STOP the last price reaches the stop loss, or (c) the last price reaches the optional invalidation price. The invalidation price must lie on the other side of the current price from the entry, so that the price can reach it before the entry; it is checked when the plan is saved and when it is activated (MSG16). A MARKET plan has no invalidation price. When one 1-minute candle reaches both the entry and an invalidation level, the level that its opening price is already beyond decides; otherwise the plan is invalidated. Prices from before the activation are not used, and candles evaluated after downtime follow the same rules. An INVALIDATED or EXPIRED plan no longer counts toward the limit of ACTIVE plans (BR-62); the Trader is notified with the reason (MSG53, MSG54).</w:t>
             </w:r>
           </w:p>
         </w:tc>
@@ -28028,7 +28028,7 @@
               <w:rPr>
                 <w:sz w:val="18"/>
               </w:rPr>
-              <w:t xml:space="preserve">Entry deviation: the planned entry price is the entered price for LIMIT and STOP plans and the reference price at the last draft save for MARKET plans. Deviation in R = d × (fill price − planned entry price) / |planned entry price − stop loss|, with d = +1 for LONG and −1 for SHORT; a positive value is a worse entry. When a MARKET plan is activated, a deviation below ENTRY_DEVIATION_CONFIRM_R (default 0.25) is accepted; a deviation from that value up to and including ENTRY_DEVIATION_BLOCK_R (default 0.75) requires the Trader to confirm the recalculated quantity, risk/reward and deviation (MSG51); a larger deviation, or a price at or beyond the take profit, is refused (MSG52). A plan may set its own maximum deviation, which can only be lower than ENTRY_DEVIATION_BLOCK_R. The risk amount stays as planned and the quantity is recalculated. Every fill records its deviation.</w:t>
+              <w:t xml:space="preserve">Entry deviation: the planned entry price is the entered price for LIMIT and STOP plans and the reference price at the last draft save for MARKET plans. Deviation in R = d × (fill price − planned entry price) / |planned entry price − stop loss|, with d = +1 for LONG and −1 for SHORT; a positive value is a worse entry. When a MARKET plan is activated, a deviation below ENTRY_DEVIATION_CONFIRM_R (default 0.25) is accepted; a deviation from that value up to and including ENTRY_DEVIATION_BLOCK_R (default 0.75) requires the Trader to confirm the recalculated quantity, risk/reward and deviation (MSG51); a larger deviation, or a price at or beyond the take profit, is refused (MSG52). A plan may set its own maximum deviation, which must not be higher than ENTRY_DEVIATION_BLOCK_R (MSG15 when saved); the lower of the two applies, and when the plan's value is below ENTRY_DEVIATION_CONFIRM_R there is no confirmation step. The risk amount stays as planned and the quantity is recalculated. Every fill records its deviation.</w:t>
             </w:r>
           </w:p>
         </w:tc>
@@ -28058,7 +28058,7 @@
               <w:rPr>
                 <w:sz w:val="18"/>
               </w:rPr>
-              <w:t xml:space="preserve">Learning data of a simulated trade: at the fill the system stores the planned entry price, the deviation (BR-69), the liquidity role (BR-36), the planned risk amount, the setup score of the plan and at the fill, and the indicator values at the fill (RSI14, EMA20, EMA50, EMA200, MACD). A drop of the setup score of at least SETUP_SCORE_DROP_WARN points (default 15) adds a warning to the journal entry and notifies the Trader (MSG55); it never blocks the fill. While the position is open the system keeps its most adverse and most favourable price. Derived and not stored: R-multiple = net profit/loss / planned risk amount (the realized R of BR-42); expectancy = average R-multiple; average deviation and cost of late entry = sum of the deviations in R; maximum adverse and favourable excursion in R = excursion × quantity / planned risk amount.</w:t>
+              <w:t xml:space="preserve">Learning data of a simulated trade: at the fill the system stores the planned entry price, the deviation (BR-69), the liquidity role (BR-36), the planned risk amount, the setup score of the plan and at the fill, and the indicator values at the fill (RSI14, EMA20, EMA50, EMA200, MACD). The setup score of the plan is computed at activation with the Trader's preset at that time and stored with the preset name and version; the score at the fill uses the same preset; both scores and the indicator values use the latest closed candle of the plan's analysis timeframe, never a forming candle; when either score is unknown there is no comparison. A drop of the setup score of at least SETUP_SCORE_DROP_WARN points (default 15) adds a warning to the journal entry and notifies the Trader (MSG55); it never blocks the fill. While the position is open the system keeps its most adverse and most favourable price. Derived and not stored: R-multiple = net profit/loss / planned risk amount (the realized R of BR-42); expectancy = average R-multiple; average deviation and cost of late entry = sum of the deviations in R; maximum adverse and favourable excursion in R = excursion × quantity / planned risk amount.</w:t>
             </w:r>
           </w:p>
         </w:tc>
@@ -29691,7 +29691,7 @@
               <w:rPr>
                 <w:sz w:val="17"/>
               </w:rPr>
-              <w:t>Price order invalid for direction</w:t>
+              <w:t>Price on the wrong side for the direction (BR-22, BR-68, 3.5.3)</w:t>
             </w:r>
           </w:p>
         </w:tc>

</xml_diff>

<commit_message>
TP-0: done; D-116 fee-aware risk panel, A-50, D-112 note; TD 5.6, 7.5, 7.7, 7.8; SRS BR-29, 3.5.1; TP-B next
</commit_message>
<xml_diff>
--- a/docs/srs/CryptoPilot_Report3_SRS_v1.0.docx
+++ b/docs/srs/CryptoPilot_Report3_SRS_v1.0.docx
@@ -592,6 +592,70 @@
           </w:p>
         </w:tc>
       </w:tr>
+      <w:tr>
+        <w:tc>
+          <w:tcPr>
+            <w:tcW w:type="dxa" w:w="1440"/>
+          </w:tcPr>
+          <w:p>
+            <w:pPr>
+              <w:jc w:val="center"/>
+            </w:pPr>
+            <w:r/>
+            <w:r>
+              <w:rPr>
+                <w:sz w:val="19"/>
+              </w:rPr>
+              <w:t xml:space="preserve">24/10/2026</w:t>
+            </w:r>
+          </w:p>
+        </w:tc>
+        <w:tc>
+          <w:tcPr>
+            <w:tcW w:type="dxa" w:w="1152"/>
+          </w:tcPr>
+          <w:p>
+            <w:pPr>
+              <w:jc w:val="center"/>
+            </w:pPr>
+            <w:r/>
+            <w:r>
+              <w:rPr>
+                <w:sz w:val="19"/>
+              </w:rPr>
+              <w:t xml:space="preserve">M</w:t>
+            </w:r>
+          </w:p>
+        </w:tc>
+        <w:tc>
+          <w:tcPr>
+            <w:tcW w:type="dxa" w:w="1872"/>
+          </w:tcPr>
+          <w:p>
+            <w:r/>
+            <w:r>
+              <w:rPr>
+                <w:sz w:val="19"/>
+              </w:rPr>
+              <w:t xml:space="preserve">CryptoPilot Team</w:t>
+            </w:r>
+          </w:p>
+        </w:tc>
+        <w:tc>
+          <w:tcPr>
+            <w:tcW w:type="dxa" w:w="4464"/>
+          </w:tcPr>
+          <w:p>
+            <w:r/>
+            <w:r>
+              <w:rPr>
+                <w:sz w:val="19"/>
+              </w:rPr>
+              <w:t xml:space="preserve">BR-29 and 3.5.1: ninth warning HIGH_FEE_SHARE (WARNING) when the expected fees and slippage at the stop loss are at least 20% of the risk amount; the risk panel shows the estimated fees, the slippage, the real loss at the stop loss and the risk/reward ratio after fees (A-50). The quantity is still sized under BR-23.</w:t>
+            </w:r>
+          </w:p>
+        </w:tc>
+      </w:tr>
     </w:tbl>
     <w:p>
       <w:pPr>
@@ -19789,7 +19853,7 @@
         <w:spacing w:after="60"/>
       </w:pPr>
       <w:r>
-        <w:t>The risk panel is recalculated on every change (within 300 ms): quantity, notional value, initial margin, risk amount, reward amount, risk/reward ratio, estimated liquidation price and the maintenance margin rate used (BR-23 to BR-27).</w:t>
+        <w:t>The risk panel is recalculated on every change (within 300 ms): quantity, notional value, initial margin, risk amount, reward amount, risk/reward ratio, estimated liquidation price and the maintenance margin rate used (BR-23 to BR-27), and the expected costs of the trade: the estimated entry, stop loss exit and take profit exit fees and the slippage (BR-36), the real loss at the stop loss (risk amount plus those fees and slippage), its share of the risk amount and the risk/reward ratio after fees (BR-29); funding and the liquidation clearance fee are not included.</w:t>
       </w:r>
     </w:p>
     <w:p>
@@ -26828,7 +26892,7 @@
               <w:rPr>
                 <w:sz w:val="18"/>
               </w:rPr>
-              <w:t>Warnings (8 types; INSUFFICIENT_CAPITAL and SL_BEYOND_LIQUIDATION are BLOCKING under BR-25, BR-26 and BR-28): LOW_RR (WARNING) when risk/reward &lt; 1.5; OVERSIZED_POSITION (WARNING) when risk % is greater than the risk per trade of the Trader's risk profile (BR-66); HIGH_LEVERAGE (WARNING) when leverage is greater than the maximum leverage of the risk profile; TOTAL_OPEN_RISK (WARNING) when the risk amount of the plan plus the risk amounts of the Trader's other ACTIVE plans and open positions, as a percentage of capital, is greater than the maximum total open risk of the risk profile (BR-66); WIDE_STOP_LOSS (INFO) when |entry − stop loss| / entry &gt; 10%; HIGH_FUNDING_RATE (WARNING) when |funding rate| ≥ 0.1% and the position would pay funding. Thresholds not defined by the risk profile are configurable in System Settings. A plan with a BLOCKING warning cannot be activated.</w:t>
+              <w:t>Warnings (9 types; INSUFFICIENT_CAPITAL and SL_BEYOND_LIQUIDATION are BLOCKING under BR-25, BR-26 and BR-28): LOW_RR (WARNING) when risk/reward &lt; 1.5; OVERSIZED_POSITION (WARNING) when risk % is greater than the risk per trade of the Trader's risk profile (BR-66); HIGH_LEVERAGE (WARNING) when leverage is greater than the maximum leverage of the risk profile; TOTAL_OPEN_RISK (WARNING) when the risk amount of the plan plus the risk amounts of the Trader's other ACTIVE plans and open positions, as a percentage of capital, is greater than the maximum total open risk of the risk profile (BR-66); WIDE_STOP_LOSS (INFO) when |entry − stop loss| / entry &gt; 10%; HIGH_FUNDING_RATE (WARNING) when |funding rate| ≥ 0.1% and the position would pay funding; HIGH_FEE_SHARE (WARNING) when the expected trading fees and slippage of a trade closed at the stop loss are at least 20% of the risk amount (fees by the expected liquidity role of each fill and slippage under BR-36; funding and the liquidation clearance fee are not included; the quantity is still sized under BR-23). Thresholds not defined by the risk profile are configurable in System Settings. A plan with a BLOCKING warning cannot be activated.</w:t>
             </w:r>
           </w:p>
         </w:tc>

</xml_diff>